<commit_message>
docs: update PRD version to 0.6 to reflect current app architecture, naming, and development status
</commit_message>
<xml_diff>
--- a/docs/PRD.docx
+++ b/docs/PRD.docx
@@ -23,7 +23,7 @@
         <w:t xml:space="preserve">Version:</w:t>
       </w:r>
       <w:r>
-        <w:t xml:space="preserve"> 0.1 (draft for design)</w:t>
+        <w:t xml:space="preserve"> 0.6 — reconciled with the shipped app and the live backend</w:t>
       </w:r>
     </w:p>
     <w:p>
@@ -38,7 +38,7 @@
         <w:t xml:space="preserve">Date:</w:t>
       </w:r>
       <w:r>
-        <w:t xml:space="preserve"> 2026-08-13</w:t>
+        <w:t xml:space="preserve"> 2026-08-16 (first drafted 2026-08-13)</w:t>
       </w:r>
     </w:p>
     <w:p>
@@ -53,7 +53,18 @@
         <w:t xml:space="preserve">Status:</w:t>
       </w:r>
       <w:r>
-        <w:t xml:space="preserve"> Draft — feeds Claude Design for UI exploration</w:t>
+        <w:t xml:space="preserve"> Living document. Where it disagrees with </w:t>
+      </w:r>
+      <w:r>
+        <w:rPr>
+          <w:rFonts w:ascii="Courier New" w:cs="Courier New" w:eastAsia="Courier New" w:hAnsi="Courier New"/>
+          <w:sz w:val="20"/>
+          <w:szCs w:val="20"/>
+        </w:rPr>
+        <w:t xml:space="preserve">https://api.tsion.io/openapi.json</w:t>
+      </w:r>
+      <w:r>
+        <w:t xml:space="preserve">, the gateway wins.</w:t>
       </w:r>
     </w:p>
     <w:p>
@@ -79,7 +90,65 @@
         <w:t xml:space="preserve">Primal</w:t>
       </w:r>
       <w:r>
-        <w:t xml:space="preserve"> (Expo SDK 57 · React Native 0.86 · expo-router · NativeWind)</w:t>
+        <w:t xml:space="preserve"> (Expo SDK 57 · React Native 0.86 · expo-router · dev build, not Expo Go)</w:t>
+      </w:r>
+    </w:p>
+    <w:p>
+      <w:pPr>
+        <w:spacing w:after="120"/>
+      </w:pPr>
+      <w:r>
+        <w:t xml:space="preserve">&gt; </w:t>
+      </w:r>
+      <w:r>
+        <w:rPr>
+          <w:b/>
+          <w:bCs/>
+        </w:rPr>
+        <w:t xml:space="preserve">On the name.</w:t>
+      </w:r>
+      <w:r>
+        <w:t xml:space="preserve"> The client renamed the app </w:t>
+      </w:r>
+      <w:r>
+        <w:rPr>
+          <w:b/>
+          <w:bCs/>
+        </w:rPr>
+        <w:t xml:space="preserve">Paradigm</w:t>
+      </w:r>
+      <w:r>
+        <w:t xml:space="preserve"> on 2026-08-14 — that is what ships, and what every screen says. The backend, its gateway and its docs still say </w:t>
+      </w:r>
+      <w:r>
+        <w:rPr>
+          <w:b/>
+          <w:bCs/>
+        </w:rPr>
+        <w:t xml:space="preserve">Primal</w:t>
+      </w:r>
+      <w:r>
+        <w:t xml:space="preserve">, so both names appear here on purpose: </w:t>
+      </w:r>
+      <w:r>
+        <w:rPr>
+          <w:i/>
+          <w:iCs/>
+        </w:rPr>
+        <w:t xml:space="preserve">Paradigm</w:t>
+      </w:r>
+      <w:r>
+        <w:t xml:space="preserve"> is the product, </w:t>
+      </w:r>
+      <w:r>
+        <w:rPr>
+          <w:i/>
+          <w:iCs/>
+        </w:rPr>
+        <w:t xml:space="preserve">Primal</w:t>
+      </w:r>
+      <w:r>
+        <w:t xml:space="preserve"> is the platform/API it talks to. Worth settling before launch copy is written.</w:t>
       </w:r>
     </w:p>
     <w:p>
@@ -607,14 +676,14 @@
         <w:spacing w:after="120" w:before="240"/>
       </w:pPr>
       <w:r>
-        <w:t xml:space="preserve">F1 — Authentication (Decane Kit + KingsChat) · </w:t>
-      </w:r>
-      <w:r>
-        <w:rPr>
-          <w:b/>
-          <w:bCs/>
-        </w:rPr>
-        <w:t xml:space="preserve">PHASE 1, BUILD NOW</w:t>
+        <w:t xml:space="preserve">F1 — Authentication (Decane + SIWE) · </w:t>
+      </w:r>
+      <w:r>
+        <w:rPr>
+          <w:b/>
+          <w:bCs/>
+        </w:rPr>
+        <w:t xml:space="preserve">BUILT</w:t>
       </w:r>
     </w:p>
     <w:p>
@@ -622,24 +691,118 @@
         <w:spacing w:after="120"/>
       </w:pPr>
       <w:r>
-        <w:t xml:space="preserve">Auth root switched from Privy to </w:t>
-      </w:r>
-      <w:r>
-        <w:rPr>
-          <w:b/>
-          <w:bCs/>
-        </w:rPr>
-        <w:t xml:space="preserve">Decane Kit</w:t>
-      </w:r>
-      <w:r>
-        <w:t xml:space="preserve"> (decision 2026-08-13) — the driver is </w:t>
-      </w:r>
-      <w:r>
-        <w:rPr>
-          <w:b/>
-          <w:bCs/>
-        </w:rPr>
-        <w:t xml:space="preserve">KingsChat sign-in</w:t>
+        <w:t xml:space="preserve">Two layers, and the distinction matters: </w:t>
+      </w:r>
+      <w:r>
+        <w:rPr>
+          <w:b/>
+          <w:bCs/>
+        </w:rPr>
+        <w:t xml:space="preserve">Decane owns the wallet, the gateway owns the session.</w:t>
+      </w:r>
+    </w:p>
+    <w:p>
+      <w:pPr>
+        <w:spacing w:after="120"/>
+      </w:pPr>
+      <w:r>
+        <w:rPr>
+          <w:b/>
+          <w:bCs/>
+        </w:rPr>
+        <w:t xml:space="preserve">Layer 1 — Decane (</w:t>
+      </w:r>
+      <w:r>
+        <w:rPr>
+          <w:rFonts w:ascii="Courier New" w:cs="Courier New" w:eastAsia="Courier New" w:hAnsi="Courier New"/>
+          <w:b/>
+          <w:bCs/>
+          <w:sz w:val="20"/>
+          <w:szCs w:val="20"/>
+        </w:rPr>
+        <w:t xml:space="preserve">decane-connect-kit-expo</w:t>
+      </w:r>
+      <w:r>
+        <w:rPr>
+          <w:b/>
+          <w:bCs/>
+        </w:rPr>
+        <w:t xml:space="preserve"> 0.1.x, native).</w:t>
+      </w:r>
+      <w:r>
+        <w:t xml:space="preserve"> Sign in with </w:t>
+      </w:r>
+      <w:r>
+        <w:rPr>
+          <w:b/>
+          <w:bCs/>
+        </w:rPr>
+        <w:t xml:space="preserve">KingsChat</w:t>
+      </w:r>
+      <w:r>
+        <w:t xml:space="preserve">, Google or email; the SDK mints a non-custodial wallet whose key is Shamir-split three ways (device / Decane key server / recovery) and signs inside a TEE, unlocked by passkey or PIN. It exposes </w:t>
+      </w:r>
+      <w:r>
+        <w:rPr>
+          <w:rFonts w:ascii="Courier New" w:cs="Courier New" w:eastAsia="Courier New" w:hAnsi="Courier New"/>
+          <w:sz w:val="20"/>
+          <w:szCs w:val="20"/>
+        </w:rPr>
+        <w:t xml:space="preserve">addresses: { evm, solana, tron }</w:t>
+      </w:r>
+      <w:r>
+        <w:t xml:space="preserve"> plus </w:t>
+      </w:r>
+      <w:r>
+        <w:rPr>
+          <w:rFonts w:ascii="Courier New" w:cs="Courier New" w:eastAsia="Courier New" w:hAnsi="Courier New"/>
+          <w:sz w:val="20"/>
+          <w:szCs w:val="20"/>
+        </w:rPr>
+        <w:t xml:space="preserve">signMessage</w:t>
+      </w:r>
+      <w:r>
+        <w:t xml:space="preserve"> / </w:t>
+      </w:r>
+      <w:r>
+        <w:rPr>
+          <w:rFonts w:ascii="Courier New" w:cs="Courier New" w:eastAsia="Courier New" w:hAnsi="Courier New"/>
+          <w:sz w:val="20"/>
+          <w:szCs w:val="20"/>
+        </w:rPr>
+        <w:t xml:space="preserve">sendTransaction</w:t>
+      </w:r>
+      <w:r>
+        <w:t xml:space="preserve"> / </w:t>
+      </w:r>
+      <w:r>
+        <w:rPr>
+          <w:rFonts w:ascii="Courier New" w:cs="Courier New" w:eastAsia="Courier New" w:hAnsi="Courier New"/>
+          <w:sz w:val="20"/>
+          <w:szCs w:val="20"/>
+        </w:rPr>
+        <w:t xml:space="preserve">signAuthorization</w:t>
+      </w:r>
+      <w:r>
+        <w:t xml:space="preserve"> (EIP-7702) / </w:t>
+      </w:r>
+      <w:r>
+        <w:rPr>
+          <w:rFonts w:ascii="Courier New" w:cs="Courier New" w:eastAsia="Courier New" w:hAnsi="Courier New"/>
+          <w:sz w:val="20"/>
+          <w:szCs w:val="20"/>
+        </w:rPr>
+        <w:t xml:space="preserve">signSolanaTransaction</w:t>
+      </w:r>
+      <w:r>
+        <w:t xml:space="preserve">. No server ever signs for the user. It is native-only, so the app runs as a </w:t>
+      </w:r>
+      <w:r>
+        <w:rPr>
+          <w:b/>
+          <w:bCs/>
+        </w:rPr>
+        <w:t xml:space="preserve">dev build, not Expo Go</w:t>
       </w:r>
       <w:r>
         <w:t xml:space="preserve">.</w:t>
@@ -654,140 +817,183 @@
           <w:b/>
           <w:bCs/>
         </w:rPr>
-        <w:t xml:space="preserve">How KingsChat comes in.</w:t>
-      </w:r>
-      <w:r>
-        <w:t xml:space="preserve"> Decane's built-in </w:t>
-      </w:r>
-      <w:r>
-        <w:rPr>
-          <w:rFonts w:ascii="Courier New" w:cs="Courier New" w:eastAsia="Courier New" w:hAnsi="Courier New"/>
-          <w:sz w:val="20"/>
-          <w:szCs w:val="20"/>
-        </w:rPr>
-        <w:t xml:space="preserve">authMethods</w:t>
-      </w:r>
-      <w:r>
-        <w:t xml:space="preserve"> are only </w:t>
-      </w:r>
-      <w:r>
-        <w:rPr>
-          <w:rFonts w:ascii="Courier New" w:cs="Courier New" w:eastAsia="Courier New" w:hAnsi="Courier New"/>
-          <w:sz w:val="20"/>
-          <w:szCs w:val="20"/>
-        </w:rPr>
-        <w:t xml:space="preserve">"google" | "email"</w:t>
-      </w:r>
-      <w:r>
-        <w:t xml:space="preserve"> — KingsChat is not built-in. It arrives through Decane </w:t>
-      </w:r>
-      <w:r>
-        <w:rPr>
-          <w:b/>
-          <w:bCs/>
-        </w:rPr>
-        <w:t xml:space="preserve">custom auth</w:t>
-      </w:r>
-      <w:r>
-        <w:t xml:space="preserve">: register a JWT issuer (its </w:t>
-      </w:r>
-      <w:r>
-        <w:rPr>
-          <w:rFonts w:ascii="Courier New" w:cs="Courier New" w:eastAsia="Courier New" w:hAnsi="Courier New"/>
-          <w:sz w:val="20"/>
-          <w:szCs w:val="20"/>
-        </w:rPr>
-        <w:t xml:space="preserve">iss</w:t>
-      </w:r>
-      <w:r>
-        <w:t xml:space="preserve">, an </w:t>
-      </w:r>
-      <w:r>
-        <w:rPr>
-          <w:rFonts w:ascii="Courier New" w:cs="Courier New" w:eastAsia="Courier New" w:hAnsi="Courier New"/>
-          <w:sz w:val="20"/>
-          <w:szCs w:val="20"/>
-        </w:rPr>
-        <w:t xml:space="preserve">https://</w:t>
-      </w:r>
-      <w:r>
-        <w:t xml:space="preserve"> JWKS URL, RS256 or ES256, identity claim defaulting to </w:t>
-      </w:r>
-      <w:r>
-        <w:rPr>
-          <w:rFonts w:ascii="Courier New" w:cs="Courier New" w:eastAsia="Courier New" w:hAnsi="Courier New"/>
-          <w:sz w:val="20"/>
-          <w:szCs w:val="20"/>
-        </w:rPr>
-        <w:t xml:space="preserve">sub</w:t>
-      </w:r>
-      <w:r>
-        <w:t xml:space="preserve">) in the Decane dashboard, and the SDK exchanges that issuer's tokens for Decane sessions, rendering the extra login button automatically via </w:t>
-      </w:r>
-      <w:r>
-        <w:rPr>
-          <w:rFonts w:ascii="Courier New" w:cs="Courier New" w:eastAsia="Courier New" w:hAnsi="Courier New"/>
-          <w:sz w:val="20"/>
-          <w:szCs w:val="20"/>
-        </w:rPr>
-        <w:t xml:space="preserve">customAuth: { label, getToken }</w:t>
-      </w:r>
-      <w:r>
-        <w:t xml:space="preserve">. So we build a small </w:t>
-      </w:r>
-      <w:r>
-        <w:rPr>
-          <w:b/>
-          <w:bCs/>
-        </w:rPr>
-        <w:t xml:space="preserve">KingsChat bridge issuer</w:t>
-      </w:r>
-      <w:r>
-        <w:t xml:space="preserve">:</w:t>
-      </w:r>
-    </w:p>
-    <w:p>
-      <w:pPr>
-        <w:pStyle w:val="ListParagraph"/>
-        <w:numPr>
-          <w:ilvl w:val="0"/>
-          <w:numId w:val="3"/>
-        </w:numPr>
-        <w:spacing w:after="60"/>
-      </w:pPr>
-      <w:r>
-        <w:t xml:space="preserve">User taps "Continue with KingsChat" → KingsChat OAuth (their </w:t>
-      </w:r>
-      <w:r>
-        <w:rPr>
-          <w:rFonts w:ascii="Courier New" w:cs="Courier New" w:eastAsia="Courier New" w:hAnsi="Courier New"/>
-          <w:sz w:val="20"/>
-          <w:szCs w:val="20"/>
-        </w:rPr>
-        <w:t xml:space="preserve">kingschat-web-sdk</w:t>
-      </w:r>
-      <w:r>
-        <w:t xml:space="preserve"> flow).</w:t>
-      </w:r>
-    </w:p>
-    <w:p>
-      <w:pPr>
-        <w:pStyle w:val="ListParagraph"/>
-        <w:numPr>
-          <w:ilvl w:val="0"/>
-          <w:numId w:val="3"/>
-        </w:numPr>
-        <w:spacing w:after="60"/>
-      </w:pPr>
-      <w:r>
-        <w:t xml:space="preserve">Our bridge verifies the KingsChat access token against KingsChat's API and mints a short-lived </w:t>
-      </w:r>
-      <w:r>
-        <w:rPr>
-          <w:b/>
-          <w:bCs/>
-        </w:rPr>
-        <w:t xml:space="preserve">ES256 JWT</w:t>
+        <w:t xml:space="preserve">Layer 2 — Primal session (SIWE against </w:t>
+      </w:r>
+      <w:r>
+        <w:rPr>
+          <w:rFonts w:ascii="Courier New" w:cs="Courier New" w:eastAsia="Courier New" w:hAnsi="Courier New"/>
+          <w:b/>
+          <w:bCs/>
+          <w:sz w:val="20"/>
+          <w:szCs w:val="20"/>
+        </w:rPr>
+        <w:t xml:space="preserve">https://api.tsion.io</w:t>
+      </w:r>
+      <w:r>
+        <w:rPr>
+          <w:b/>
+          <w:bCs/>
+        </w:rPr>
+        <w:t xml:space="preserve">).</w:t>
+      </w:r>
+      <w:r>
+        <w:t xml:space="preserve"> A wallet is not a session: </w:t>
+      </w:r>
+      <w:r>
+        <w:rPr>
+          <w:rFonts w:ascii="Courier New" w:cs="Courier New" w:eastAsia="Courier New" w:hAnsi="Courier New"/>
+          <w:sz w:val="20"/>
+          <w:szCs w:val="20"/>
+        </w:rPr>
+        <w:t xml:space="preserve">POST /v1/auth/challenge</w:t>
+      </w:r>
+      <w:r>
+        <w:t xml:space="preserve"> → sign the </w:t>
+      </w:r>
+      <w:r>
+        <w:rPr>
+          <w:b/>
+          <w:bCs/>
+        </w:rPr>
+        <w:t xml:space="preserve">exact</w:t>
+      </w:r>
+      <w:r>
+        <w:t xml:space="preserve"> message with the Decane EVM key → </w:t>
+      </w:r>
+      <w:r>
+        <w:rPr>
+          <w:rFonts w:ascii="Courier New" w:cs="Courier New" w:eastAsia="Courier New" w:hAnsi="Courier New"/>
+          <w:sz w:val="20"/>
+          <w:szCs w:val="20"/>
+        </w:rPr>
+        <w:t xml:space="preserve">POST /v1/auth/verify</w:t>
+      </w:r>
+      <w:r>
+        <w:t xml:space="preserve"> → a short-lived access token plus a rotating refresh token. Refresh tokens rotate on every use, so the pair is replaced atomically and only ever one refresh is in flight. </w:t>
+      </w:r>
+      <w:r>
+        <w:rPr>
+          <w:rFonts w:ascii="Courier New" w:cs="Courier New" w:eastAsia="Courier New" w:hAnsi="Courier New"/>
+          <w:sz w:val="20"/>
+          <w:szCs w:val="20"/>
+        </w:rPr>
+        <w:t xml:space="preserve">GET /v1/auth/me</w:t>
+      </w:r>
+      <w:r>
+        <w:t xml:space="preserve"> validates a restored session — a locally decoded JWT proves nothing.</w:t>
+      </w:r>
+    </w:p>
+    <w:p>
+      <w:pPr>
+        <w:spacing w:after="120"/>
+      </w:pPr>
+      <w:r>
+        <w:rPr>
+          <w:b/>
+          <w:bCs/>
+        </w:rPr>
+        <w:t xml:space="preserve">Onboarding after auth:</w:t>
+      </w:r>
+      <w:r>
+        <w:t xml:space="preserve"> profile → PIN → passkey → done. The transaction PIN and biometric app-lock are Paradigm's own gate; Decane has no opinion about them.</w:t>
+      </w:r>
+    </w:p>
+    <w:p>
+      <w:pPr>
+        <w:spacing w:after="120"/>
+      </w:pPr>
+      <w:r>
+        <w:rPr>
+          <w:b/>
+          <w:bCs/>
+        </w:rPr>
+        <w:t xml:space="preserve">Known gap:</w:t>
+      </w:r>
+      <w:r>
+        <w:t xml:space="preserve"> </w:t>
+      </w:r>
+      <w:r>
+        <w:rPr>
+          <w:rFonts w:ascii="Courier New" w:cs="Courier New" w:eastAsia="Courier New" w:hAnsi="Courier New"/>
+          <w:sz w:val="20"/>
+          <w:szCs w:val="20"/>
+        </w:rPr>
+        <w:t xml:space="preserve">EXPO_PUBLIC_DECANE_RP_ID</w:t>
+      </w:r>
+      <w:r>
+        <w:t xml:space="preserve"> is unset, so the passkey tier is off and wallets sit on the secure-enclave tier. Setting it (plus iOS associated domains) turns passkeys on.</w:t>
+      </w:r>
+    </w:p>
+    <w:p>
+      <w:pPr>
+        <w:pStyle w:val="Heading3"/>
+        <w:spacing w:after="120" w:before="240"/>
+      </w:pPr>
+      <w:r>
+        <w:t xml:space="preserve">F1b — Membership &amp; entitlement · </w:t>
+      </w:r>
+      <w:r>
+        <w:rPr>
+          <w:b/>
+          <w:bCs/>
+        </w:rPr>
+        <w:t xml:space="preserve">REQUIRED BEFORE ANY MONEY FEATURE</w:t>
+      </w:r>
+    </w:p>
+    <w:p>
+      <w:pPr>
+        <w:spacing w:after="120"/>
+      </w:pPr>
+      <w:r>
+        <w:t xml:space="preserve">Access costs </w:t>
+      </w:r>
+      <w:r>
+        <w:rPr>
+          <w:b/>
+          <w:bCs/>
+        </w:rPr>
+        <w:t xml:space="preserve">USD 1,000 per calendar month</w:t>
+      </w:r>
+      <w:r>
+        <w:t xml:space="preserve">, and it is enforced server-side: every </w:t>
+      </w:r>
+      <w:r>
+        <w:rPr>
+          <w:rFonts w:ascii="Courier New" w:cs="Courier New" w:eastAsia="Courier New" w:hAnsi="Courier New"/>
+          <w:sz w:val="20"/>
+          <w:szCs w:val="20"/>
+        </w:rPr>
+        <w:t xml:space="preserve">/v1/linkpay/*</w:t>
+      </w:r>
+      <w:r>
+        <w:t xml:space="preserve"> route needs a valid token </w:t>
+      </w:r>
+      <w:r>
+        <w:rPr>
+          <w:b/>
+          <w:bCs/>
+        </w:rPr>
+        <w:t xml:space="preserve">and</w:t>
+      </w:r>
+      <w:r>
+        <w:t xml:space="preserve"> an active entitlement. Authentication and entitlement are separate decisions — a signed-in user with no subscription is a normal, expected state.</w:t>
+      </w:r>
+    </w:p>
+    <w:p>
+      <w:pPr>
+        <w:pStyle w:val="ListParagraph"/>
+        <w:numPr>
+          <w:ilvl w:val="0"/>
+          <w:numId w:val="1"/>
+        </w:numPr>
+        <w:spacing w:after="60"/>
+      </w:pPr>
+      <w:r>
+        <w:rPr>
+          <w:b/>
+          <w:bCs/>
+        </w:rPr>
+        <w:t xml:space="preserve">Checkout</w:t>
       </w:r>
       <w:r>
         <w:t xml:space="preserve"> (</w:t>
@@ -798,87 +1004,241 @@
           <w:sz w:val="20"/>
           <w:szCs w:val="20"/>
         </w:rPr>
-        <w:t xml:space="preserve">iss</w:t>
-      </w:r>
-      <w:r>
-        <w:t xml:space="preserve"> = our bridge, </w:t>
-      </w:r>
-      <w:r>
-        <w:rPr>
-          <w:rFonts w:ascii="Courier New" w:cs="Courier New" w:eastAsia="Courier New" w:hAnsi="Courier New"/>
-          <w:sz w:val="20"/>
-          <w:szCs w:val="20"/>
-        </w:rPr>
-        <w:t xml:space="preserve">sub</w:t>
-      </w:r>
-      <w:r>
-        <w:t xml:space="preserve"> = KingsChat user id) with a published JWKS.</w:t>
-      </w:r>
-    </w:p>
-    <w:p>
-      <w:pPr>
-        <w:pStyle w:val="ListParagraph"/>
-        <w:numPr>
-          <w:ilvl w:val="0"/>
-          <w:numId w:val="3"/>
-        </w:numPr>
-        <w:spacing w:after="60"/>
-      </w:pPr>
-      <w:r>
-        <w:t xml:space="preserve">Decane's </w:t>
-      </w:r>
-      <w:r>
-        <w:rPr>
-          <w:rFonts w:ascii="Courier New" w:cs="Courier New" w:eastAsia="Courier New" w:hAnsi="Courier New"/>
-          <w:sz w:val="20"/>
-          <w:szCs w:val="20"/>
-        </w:rPr>
-        <w:t xml:space="preserve">getToken</w:t>
-      </w:r>
-      <w:r>
-        <w:t xml:space="preserve"> returns that JWT → Decane session + social wallet, same as any login.</w:t>
-      </w:r>
-    </w:p>
-    <w:p>
-      <w:pPr>
-        <w:spacing w:after="120"/>
-      </w:pPr>
-      <w:r>
-        <w:t xml:space="preserve">Google and email stay available as Decane's built-ins on the same screen.</w:t>
-      </w:r>
-    </w:p>
-    <w:p>
-      <w:pPr>
-        <w:spacing w:after="120"/>
-      </w:pPr>
-      <w:r>
-        <w:rPr>
-          <w:b/>
-          <w:bCs/>
-        </w:rPr>
-        <w:t xml:space="preserve">Wallets.</w:t>
-      </w:r>
-      <w:r>
-        <w:t xml:space="preserve"> The Decane social wallet exposes </w:t>
-      </w:r>
-      <w:r>
-        <w:rPr>
-          <w:rFonts w:ascii="Courier New" w:cs="Courier New" w:eastAsia="Courier New" w:hAnsi="Courier New"/>
-          <w:sz w:val="20"/>
-          <w:szCs w:val="20"/>
-        </w:rPr>
-        <w:t xml:space="preserve">addresses: { evm, solana }</w:t>
-      </w:r>
-      <w:r>
-        <w:t xml:space="preserve"> with </w:t>
-      </w:r>
-      <w:r>
-        <w:rPr>
-          <w:rFonts w:ascii="Courier New" w:cs="Courier New" w:eastAsia="Courier New" w:hAnsi="Courier New"/>
-          <w:sz w:val="20"/>
-          <w:szCs w:val="20"/>
-        </w:rPr>
-        <w:t xml:space="preserve">signMessage</w:t>
+        <w:t xml:space="preserve">POST /v1/subscriptions</w:t>
+      </w:r>
+      <w:r>
+        <w:t xml:space="preserve">) returns a </w:t>
+      </w:r>
+      <w:r>
+        <w:rPr>
+          <w:b/>
+          <w:bCs/>
+        </w:rPr>
+        <w:t xml:space="preserve">one-time deposit address</w:t>
+      </w:r>
+      <w:r>
+        <w:t xml:space="preserve"> from Dextopus with a grossed-up </w:t>
+      </w:r>
+      <w:r>
+        <w:rPr>
+          <w:rFonts w:ascii="Courier New" w:cs="Courier New" w:eastAsia="Courier New" w:hAnsi="Courier New"/>
+          <w:sz w:val="20"/>
+          <w:szCs w:val="20"/>
+        </w:rPr>
+        <w:t xml:space="preserve">originAmount</w:t>
+      </w:r>
+      <w:r>
+        <w:t xml:space="preserve"> and an expiry. Never the treasury address; never a shared address.</w:t>
+      </w:r>
+    </w:p>
+    <w:p>
+      <w:pPr>
+        <w:pStyle w:val="ListParagraph"/>
+        <w:numPr>
+          <w:ilvl w:val="0"/>
+          <w:numId w:val="1"/>
+        </w:numPr>
+        <w:spacing w:after="60"/>
+      </w:pPr>
+      <w:r>
+        <w:rPr>
+          <w:b/>
+          <w:bCs/>
+        </w:rPr>
+        <w:t xml:space="preserve">Confirmation is the backend's</w:t>
+      </w:r>
+      <w:r>
+        <w:t xml:space="preserve"> (</w:t>
+      </w:r>
+      <w:r>
+        <w:rPr>
+          <w:rFonts w:ascii="Courier New" w:cs="Courier New" w:eastAsia="Courier New" w:hAnsi="Courier New"/>
+          <w:sz w:val="20"/>
+          <w:szCs w:val="20"/>
+        </w:rPr>
+        <w:t xml:space="preserve">GET /v1/subscriptions/{id}/payment</w:t>
+      </w:r>
+      <w:r>
+        <w:t xml:space="preserve"> → </w:t>
+      </w:r>
+      <w:r>
+        <w:rPr>
+          <w:rFonts w:ascii="Courier New" w:cs="Courier New" w:eastAsia="Courier New" w:hAnsi="Courier New"/>
+          <w:sz w:val="20"/>
+          <w:szCs w:val="20"/>
+        </w:rPr>
+        <w:t xml:space="preserve">AWAITING_TRANSFER</w:t>
+      </w:r>
+      <w:r>
+        <w:t xml:space="preserve"> → </w:t>
+      </w:r>
+      <w:r>
+        <w:rPr>
+          <w:rFonts w:ascii="Courier New" w:cs="Courier New" w:eastAsia="Courier New" w:hAnsi="Courier New"/>
+          <w:sz w:val="20"/>
+          <w:szCs w:val="20"/>
+        </w:rPr>
+        <w:t xml:space="preserve">PROCESSING</w:t>
+      </w:r>
+      <w:r>
+        <w:t xml:space="preserve"> → </w:t>
+      </w:r>
+      <w:r>
+        <w:rPr>
+          <w:rFonts w:ascii="Courier New" w:cs="Courier New" w:eastAsia="Courier New" w:hAnsi="Courier New"/>
+          <w:sz w:val="20"/>
+          <w:szCs w:val="20"/>
+        </w:rPr>
+        <w:t xml:space="preserve">SETTLED</w:t>
+      </w:r>
+      <w:r>
+        <w:t xml:space="preserve">). A wallet transaction hash is not proof; the UI must never unlock itself on one.</w:t>
+      </w:r>
+    </w:p>
+    <w:p>
+      <w:pPr>
+        <w:pStyle w:val="ListParagraph"/>
+        <w:numPr>
+          <w:ilvl w:val="0"/>
+          <w:numId w:val="1"/>
+        </w:numPr>
+        <w:spacing w:after="60"/>
+      </w:pPr>
+      <w:r>
+        <w:rPr>
+          <w:b/>
+          <w:bCs/>
+        </w:rPr>
+        <w:t xml:space="preserve">Entitlement propagates asynchronously</w:t>
+      </w:r>
+      <w:r>
+        <w:t xml:space="preserve"> after </w:t>
+      </w:r>
+      <w:r>
+        <w:rPr>
+          <w:rFonts w:ascii="Courier New" w:cs="Courier New" w:eastAsia="Courier New" w:hAnsi="Courier New"/>
+          <w:sz w:val="20"/>
+          <w:szCs w:val="20"/>
+        </w:rPr>
+        <w:t xml:space="preserve">SETTLED</w:t>
+      </w:r>
+      <w:r>
+        <w:t xml:space="preserve">, so a protected call can still 403 for a moment. That window gets its own state ("Payment confirmed. Enabling your account.") and a bounded retry — never a second checkout.</w:t>
+      </w:r>
+    </w:p>
+    <w:p>
+      <w:pPr>
+        <w:pStyle w:val="ListParagraph"/>
+        <w:numPr>
+          <w:ilvl w:val="0"/>
+          <w:numId w:val="1"/>
+        </w:numPr>
+        <w:spacing w:after="60"/>
+      </w:pPr>
+      <w:r>
+        <w:rPr>
+          <w:b/>
+          <w:bCs/>
+        </w:rPr>
+        <w:t xml:space="preserve">A 403 </w:t>
+      </w:r>
+      <w:r>
+        <w:rPr>
+          <w:rFonts w:ascii="Courier New" w:cs="Courier New" w:eastAsia="Courier New" w:hAnsi="Courier New"/>
+          <w:b/>
+          <w:bCs/>
+          <w:sz w:val="20"/>
+          <w:szCs w:val="20"/>
+        </w:rPr>
+        <w:t xml:space="preserve">ACTIVE_SUBSCRIPTION_REQUIRED</w:t>
+      </w:r>
+      <w:r>
+        <w:rPr>
+          <w:b/>
+          <w:bCs/>
+        </w:rPr>
+        <w:t xml:space="preserve"> routes to the paywall, never to sign-in.</w:t>
+      </w:r>
+      <w:r>
+        <w:t xml:space="preserve"> Expired entitlement is not expired authentication.</w:t>
+      </w:r>
+    </w:p>
+    <w:p>
+      <w:pPr>
+        <w:pStyle w:val="ListParagraph"/>
+        <w:numPr>
+          <w:ilvl w:val="0"/>
+          <w:numId w:val="1"/>
+        </w:numPr>
+        <w:spacing w:after="60"/>
+      </w:pPr>
+      <w:r>
+        <w:rPr>
+          <w:b/>
+          <w:bCs/>
+        </w:rPr>
+        <w:t xml:space="preserve">Renewal is explicit</w:t>
+      </w:r>
+      <w:r>
+        <w:t xml:space="preserve"> — there is no automatic recurring debit. New month, new checkout, new idempotency key.</w:t>
+      </w:r>
+    </w:p>
+    <w:p>
+      <w:pPr>
+        <w:pStyle w:val="Heading3"/>
+        <w:spacing w:after="120" w:before="240"/>
+      </w:pPr>
+      <w:r>
+        <w:t xml:space="preserve">F2 — Account number per user · </w:t>
+      </w:r>
+      <w:r>
+        <w:rPr>
+          <w:b/>
+          <w:bCs/>
+        </w:rPr>
+        <w:t xml:space="preserve">VIA GATEWAY</w:t>
+      </w:r>
+    </w:p>
+    <w:p>
+      <w:pPr>
+        <w:pStyle w:val="ListParagraph"/>
+        <w:numPr>
+          <w:ilvl w:val="0"/>
+          <w:numId w:val="1"/>
+        </w:numPr>
+        <w:spacing w:after="60"/>
+      </w:pPr>
+      <w:r>
+        <w:t xml:space="preserve">The account is provisioned through </w:t>
+      </w:r>
+      <w:r>
+        <w:rPr>
+          <w:rFonts w:ascii="Courier New" w:cs="Courier New" w:eastAsia="Courier New" w:hAnsi="Courier New"/>
+          <w:sz w:val="20"/>
+          <w:szCs w:val="20"/>
+        </w:rPr>
+        <w:t xml:space="preserve">POST /v1/linkpay/accounts</w:t>
+      </w:r>
+      <w:r>
+        <w:t xml:space="preserve"> with KYC (name, phone, email, BVN, country, currency) and an </w:t>
+      </w:r>
+      <w:r>
+        <w:rPr>
+          <w:b/>
+          <w:bCs/>
+        </w:rPr>
+        <w:t xml:space="preserve">idempotency key that must survive retries</w:t>
+      </w:r>
+      <w:r>
+        <w:t xml:space="preserve"> — the same key for the same attempt, a new key only for a genuinely new one. Statuses </w:t>
+      </w:r>
+      <w:r>
+        <w:rPr>
+          <w:rFonts w:ascii="Courier New" w:cs="Courier New" w:eastAsia="Courier New" w:hAnsi="Courier New"/>
+          <w:sz w:val="20"/>
+          <w:szCs w:val="20"/>
+        </w:rPr>
+        <w:t xml:space="preserve">PENDING_KYC</w:t>
       </w:r>
       <w:r>
         <w:t xml:space="preserve"> / </w:t>
@@ -889,322 +1249,127 @@
           <w:sz w:val="20"/>
           <w:szCs w:val="20"/>
         </w:rPr>
-        <w:t xml:space="preserve">sendTransaction</w:t>
-      </w:r>
-      <w:r>
-        <w:t xml:space="preserve"> / </w:t>
-      </w:r>
-      <w:r>
-        <w:rPr>
-          <w:rFonts w:ascii="Courier New" w:cs="Courier New" w:eastAsia="Courier New" w:hAnsi="Courier New"/>
-          <w:sz w:val="20"/>
-          <w:szCs w:val="20"/>
-        </w:rPr>
-        <w:t xml:space="preserve">signSolanaTransaction</w:t>
-      </w:r>
-      <w:r>
-        <w:t xml:space="preserve">; unlock is passkey-first with PIN fallback (</w:t>
-      </w:r>
-      <w:r>
-        <w:rPr>
-          <w:rFonts w:ascii="Courier New" w:cs="Courier New" w:eastAsia="Courier New" w:hAnsi="Courier New"/>
-          <w:sz w:val="20"/>
-          <w:szCs w:val="20"/>
-        </w:rPr>
-        <w:t xml:space="preserve">promptPin</w:t>
-      </w:r>
-      <w:r>
-        <w:t xml:space="preserve">), and </w:t>
-      </w:r>
-      <w:r>
-        <w:rPr>
-          <w:rFonts w:ascii="Courier New" w:cs="Courier New" w:eastAsia="Courier New" w:hAnsi="Courier New"/>
-          <w:sz w:val="20"/>
-          <w:szCs w:val="20"/>
-        </w:rPr>
-        <w:t xml:space="preserve">requireAssertionPerSignature</w:t>
-      </w:r>
-      <w:r>
-        <w:t xml:space="preserve"> can force a fresh passkey assertion per signature (60s TTL, TEE-verified) for high-value flows. No server ever signs on the user's behalf.</w:t>
-      </w:r>
-    </w:p>
-    <w:p>
-      <w:pPr>
-        <w:spacing w:after="120"/>
-      </w:pPr>
-      <w:r>
-        <w:rPr>
-          <w:b/>
-          <w:bCs/>
-        </w:rPr>
-        <w:t xml:space="preserve">Backend session.</w:t>
-      </w:r>
-      <w:r>
-        <w:t xml:space="preserve"> Client sends the Decane access token; backend verifies with </w:t>
-      </w:r>
-      <w:r>
-        <w:rPr>
-          <w:rFonts w:ascii="Courier New" w:cs="Courier New" w:eastAsia="Courier New" w:hAnsi="Courier New"/>
-          <w:b/>
-          <w:bCs/>
-          <w:sz w:val="20"/>
-          <w:szCs w:val="20"/>
-        </w:rPr>
-        <w:t xml:space="preserve">decane-node</w:t>
-      </w:r>
-      <w:r>
-        <w:t xml:space="preserve"> (ES256; static verification key recommended — offline, no network call — or JWKS with auto-rotation), checks </w:t>
-      </w:r>
-      <w:r>
-        <w:rPr>
-          <w:rFonts w:ascii="Courier New" w:cs="Courier New" w:eastAsia="Courier New" w:hAnsi="Courier New"/>
-          <w:sz w:val="20"/>
-          <w:szCs w:val="20"/>
-        </w:rPr>
-        <w:t xml:space="preserve">project_id</w:t>
-      </w:r>
-      <w:r>
-        <w:t xml:space="preserve"> against our app id, keys the user row off the stable </w:t>
-      </w:r>
-      <w:r>
-        <w:rPr>
-          <w:rFonts w:ascii="Courier New" w:cs="Courier New" w:eastAsia="Courier New" w:hAnsi="Courier New"/>
-          <w:sz w:val="20"/>
-          <w:szCs w:val="20"/>
-        </w:rPr>
-        <w:t xml:space="preserve">uid</w:t>
-      </w:r>
-      <w:r>
-        <w:t xml:space="preserve">, then issues our own short-lived JWT (LinkPay's token/middleware model). </w:t>
-      </w:r>
-      <w:r>
-        <w:rPr>
-          <w:rFonts w:ascii="Courier New" w:cs="Courier New" w:eastAsia="Courier New" w:hAnsi="Courier New"/>
-          <w:sz w:val="20"/>
-          <w:szCs w:val="20"/>
-        </w:rPr>
-        <w:t xml:space="preserve">decane-node</w:t>
-      </w:r>
-      <w:r>
-        <w:t xml:space="preserve"> is explicitly the </w:t>
-      </w:r>
-      <w:r>
-        <w:rPr>
-          <w:rFonts w:ascii="Courier New" w:cs="Courier New" w:eastAsia="Courier New" w:hAnsi="Courier New"/>
-          <w:sz w:val="20"/>
-          <w:szCs w:val="20"/>
-        </w:rPr>
-        <w:t xml:space="preserve">@privy-io/node</w:t>
-      </w:r>
-      <w:r>
-        <w:t xml:space="preserve"> drop-in, returning Privy-compatible </w:t>
-      </w:r>
-      <w:r>
-        <w:rPr>
-          <w:rFonts w:ascii="Courier New" w:cs="Courier New" w:eastAsia="Courier New" w:hAnsi="Courier New"/>
-          <w:sz w:val="20"/>
-          <w:szCs w:val="20"/>
-        </w:rPr>
-        <w:t xml:space="preserve">linkedAccounts</w:t>
-      </w:r>
-      <w:r>
-        <w:t xml:space="preserve">, which keeps the migration mechanical. Note: verification is stateless (signature + expiry + project only) — gate sensitive routes on a fresh backend check for immediate sign-out.</w:t>
-      </w:r>
-    </w:p>
-    <w:p>
-      <w:pPr>
-        <w:spacing w:after="120"/>
-      </w:pPr>
-      <w:r>
-        <w:rPr>
-          <w:b/>
-          <w:bCs/>
-        </w:rPr>
-        <w:t xml:space="preserve">⚠ Mobile-platform constraint (must resolve in Phase 1).</w:t>
-      </w:r>
-      <w:r>
-        <w:t xml:space="preserve"> </w:t>
-      </w:r>
-      <w:r>
-        <w:rPr>
-          <w:rFonts w:ascii="Courier New" w:cs="Courier New" w:eastAsia="Courier New" w:hAnsi="Courier New"/>
-          <w:sz w:val="20"/>
-          <w:szCs w:val="20"/>
-        </w:rPr>
-        <w:t xml:space="preserve">decane-connect-kit</w:t>
-      </w:r>
-      <w:r>
-        <w:t xml:space="preserve"> (2.5.0) is a </w:t>
-      </w:r>
-      <w:r>
-        <w:rPr>
-          <w:b/>
-          <w:bCs/>
-        </w:rPr>
-        <w:t xml:space="preserve">React 18 web SDK</w:t>
-      </w:r>
-      <w:r>
-        <w:t xml:space="preserve"> — sessions in </w:t>
-      </w:r>
-      <w:r>
-        <w:rPr>
-          <w:rFonts w:ascii="Courier New" w:cs="Courier New" w:eastAsia="Courier New" w:hAnsi="Courier New"/>
-          <w:sz w:val="20"/>
-          <w:szCs w:val="20"/>
-        </w:rPr>
-        <w:t xml:space="preserve">localStorage</w:t>
-      </w:r>
-      <w:r>
-        <w:t xml:space="preserve">, device key-share in IndexedDB, WebAuthn passkeys. There is </w:t>
-      </w:r>
-      <w:r>
-        <w:rPr>
-          <w:b/>
-          <w:bCs/>
-        </w:rPr>
-        <w:t xml:space="preserve">no React Native/Expo package today</w:t>
-      </w:r>
-      <w:r>
-        <w:t xml:space="preserve">. Two viable integrations for our Expo app, in preference order:</w:t>
-      </w:r>
-    </w:p>
-    <w:p>
-      <w:pPr>
-        <w:pStyle w:val="ListParagraph"/>
-        <w:numPr>
-          <w:ilvl w:val="0"/>
-          <w:numId w:val="4"/>
-        </w:numPr>
-        <w:spacing w:after="60"/>
-      </w:pPr>
-      <w:r>
-        <w:rPr>
-          <w:b/>
-          <w:bCs/>
-        </w:rPr>
-        <w:t xml:space="preserve">Hosted auth surface</w:t>
-      </w:r>
-      <w:r>
-        <w:t xml:space="preserve">: a minimal web page of ours runs Decane Kit (+ the KingsChat bridge); the app opens it with </w:t>
-      </w:r>
-      <w:r>
-        <w:rPr>
-          <w:rFonts w:ascii="Courier New" w:cs="Courier New" w:eastAsia="Courier New" w:hAnsi="Courier New"/>
-          <w:sz w:val="20"/>
-          <w:szCs w:val="20"/>
-        </w:rPr>
-        <w:t xml:space="preserve">expo-auth-session</w:t>
-      </w:r>
-      <w:r>
-        <w:t xml:space="preserve"> / </w:t>
-      </w:r>
-      <w:r>
-        <w:rPr>
-          <w:rFonts w:ascii="Courier New" w:cs="Courier New" w:eastAsia="Courier New" w:hAnsi="Courier New"/>
-          <w:sz w:val="20"/>
-          <w:szCs w:val="20"/>
-        </w:rPr>
-        <w:t xml:space="preserve">expo-web-browser</w:t>
-      </w:r>
-      <w:r>
-        <w:t xml:space="preserve">, receives the Decane access token by deep link, and uses it against our backend. Wallet </w:t>
-      </w:r>
+        <w:t xml:space="preserve">CUSTOMER_CREATED</w:t>
+      </w:r>
+      <w:r>
+        <w:t xml:space="preserve"> are resumable, not terminal; </w:t>
+      </w:r>
+      <w:r>
+        <w:rPr>
+          <w:rFonts w:ascii="Courier New" w:cs="Courier New" w:eastAsia="Courier New" w:hAnsi="Courier New"/>
+          <w:sz w:val="20"/>
+          <w:szCs w:val="20"/>
+        </w:rPr>
+        <w:t xml:space="preserve">PROVISION_FAILED</w:t>
+      </w:r>
+      <w:r>
+        <w:t xml:space="preserve"> carries a reason.</w:t>
+      </w:r>
+    </w:p>
+    <w:p>
+      <w:pPr>
+        <w:pStyle w:val="ListParagraph"/>
+        <w:numPr>
+          <w:ilvl w:val="0"/>
+          <w:numId w:val="1"/>
+        </w:numPr>
+        <w:spacing w:after="60"/>
+      </w:pPr>
+      <w:r>
+        <w:rPr>
+          <w:b/>
+          <w:bCs/>
+        </w:rPr>
+        <w:t xml:space="preserve">BVN is never logged, persisted, or sent to analytics</w:t>
+      </w:r>
+      <w:r>
+        <w:t xml:space="preserve"> — form state only, long enough to submit.</w:t>
+      </w:r>
+    </w:p>
+    <w:p>
+      <w:pPr>
+        <w:pStyle w:val="ListParagraph"/>
+        <w:numPr>
+          <w:ilvl w:val="0"/>
+          <w:numId w:val="1"/>
+        </w:numPr>
+        <w:spacing w:after="60"/>
+      </w:pPr>
+      <w:r>
+        <w:t xml:space="preserve">Read back with </w:t>
+      </w:r>
+      <w:r>
+        <w:rPr>
+          <w:rFonts w:ascii="Courier New" w:cs="Courier New" w:eastAsia="Courier New" w:hAnsi="Courier New"/>
+          <w:sz w:val="20"/>
+          <w:szCs w:val="20"/>
+        </w:rPr>
+        <w:t xml:space="preserve">GET /v1/linkpay/account</w:t>
+      </w:r>
+      <w:r>
+        <w:t xml:space="preserve">; balance from </w:t>
+      </w:r>
+      <w:r>
+        <w:rPr>
+          <w:rFonts w:ascii="Courier New" w:cs="Courier New" w:eastAsia="Courier New" w:hAnsi="Courier New"/>
+          <w:sz w:val="20"/>
+          <w:szCs w:val="20"/>
+        </w:rPr>
+        <w:t xml:space="preserve">GET /v1/linkpay/balance</w:t>
+      </w:r>
+      <w:r>
+        <w:t xml:space="preserve">. Money is integer </w:t>
+      </w:r>
+      <w:r>
+        <w:rPr>
+          <w:b/>
+          <w:bCs/>
+        </w:rPr>
+        <w:t xml:space="preserve">minor units as strings</w:t>
+      </w:r>
+      <w:r>
+        <w:t xml:space="preserve"> (₦100.00 arrives as </w:t>
+      </w:r>
+      <w:r>
+        <w:rPr>
+          <w:rFonts w:ascii="Courier New" w:cs="Courier New" w:eastAsia="Courier New" w:hAnsi="Courier New"/>
+          <w:sz w:val="20"/>
+          <w:szCs w:val="20"/>
+        </w:rPr>
+        <w:t xml:space="preserve">"10000"</w:t>
+      </w:r>
+      <w:r>
+        <w:t xml:space="preserve">) — BigInt only, never float.</w:t>
+      </w:r>
+    </w:p>
+    <w:p>
+      <w:pPr>
+        <w:pStyle w:val="ListParagraph"/>
+        <w:numPr>
+          <w:ilvl w:val="0"/>
+          <w:numId w:val="1"/>
+        </w:numPr>
+        <w:spacing w:after="60"/>
+      </w:pPr>
+      <w:r>
+        <w:t xml:space="preserve">Surface: Receive screen shows account number + bank + copy and a real scannable QR; @tag handles for in-app P2P remain a Paradigm-side concept.</w:t>
+      </w:r>
+    </w:p>
+    <w:p>
+      <w:pPr>
+        <w:pStyle w:val="ListParagraph"/>
+        <w:numPr>
+          <w:ilvl w:val="0"/>
+          <w:numId w:val="1"/>
+        </w:numPr>
+        <w:spacing w:after="60"/>
+      </w:pPr>
       <w:r>
         <w:rPr>
           <w:i/>
           <w:iCs/>
         </w:rPr>
-        <w:t xml:space="preserve">signing</w:t>
-      </w:r>
-      <w:r>
-        <w:t xml:space="preserve"> flows likewise run in that surface (in-app browser or WebView bridge) since the device share lives in its storage.</w:t>
-      </w:r>
-    </w:p>
-    <w:p>
-      <w:pPr>
-        <w:pStyle w:val="ListParagraph"/>
-        <w:numPr>
-          <w:ilvl w:val="0"/>
-          <w:numId w:val="4"/>
-        </w:numPr>
-        <w:spacing w:after="60"/>
-      </w:pPr>
-      <w:r>
-        <w:rPr>
-          <w:b/>
-          <w:bCs/>
-        </w:rPr>
-        <w:t xml:space="preserve">Ask Decane for RN support / roadmap</w:t>
-      </w:r>
-      <w:r>
-        <w:t xml:space="preserve"> — track as a dependency; adopt natively if it lands.</w:t>
-      </w:r>
-    </w:p>
-    <w:p>
-      <w:pPr>
-        <w:spacing w:after="120"/>
-      </w:pPr>
-      <w:r>
-        <w:t xml:space="preserve">Onboarding after auth is unchanged: profile → PIN → passkey → done (LinkPay's </w:t>
-      </w:r>
-      <w:r>
-        <w:rPr>
-          <w:rFonts w:ascii="Courier New" w:cs="Courier New" w:eastAsia="Courier New" w:hAnsi="Courier New"/>
-          <w:sz w:val="20"/>
-          <w:szCs w:val="20"/>
-        </w:rPr>
-        <w:t xml:space="preserve">onboardingStep</w:t>
-      </w:r>
-      <w:r>
-        <w:t xml:space="preserve"> machine).</w:t>
-      </w:r>
-    </w:p>
-    <w:p>
-      <w:pPr>
-        <w:spacing w:after="120"/>
-      </w:pPr>
-      <w:r>
-        <w:rPr>
-          <w:b/>
-          <w:bCs/>
-        </w:rPr>
-        <w:t xml:space="preserve">Packages:</w:t>
-      </w:r>
-      <w:r>
-        <w:t xml:space="preserve"> </w:t>
-      </w:r>
-      <w:r>
-        <w:rPr>
-          <w:rFonts w:ascii="Courier New" w:cs="Courier New" w:eastAsia="Courier New" w:hAnsi="Courier New"/>
-          <w:sz w:val="20"/>
-          <w:szCs w:val="20"/>
-        </w:rPr>
-        <w:t xml:space="preserve">decane-connect-kit</w:t>
-      </w:r>
-      <w:r>
-        <w:t xml:space="preserve"> 2.5.x (web auth surface), </w:t>
-      </w:r>
-      <w:r>
-        <w:rPr>
-          <w:rFonts w:ascii="Courier New" w:cs="Courier New" w:eastAsia="Courier New" w:hAnsi="Courier New"/>
-          <w:sz w:val="20"/>
-          <w:szCs w:val="20"/>
-        </w:rPr>
-        <w:t xml:space="preserve">decane-node</w:t>
-      </w:r>
-      <w:r>
-        <w:t xml:space="preserve"> 1.1.x (backend), </w:t>
-      </w:r>
-      <w:r>
-        <w:rPr>
-          <w:rFonts w:ascii="Courier New" w:cs="Courier New" w:eastAsia="Courier New" w:hAnsi="Courier New"/>
-          <w:sz w:val="20"/>
-          <w:szCs w:val="20"/>
-        </w:rPr>
-        <w:t xml:space="preserve">kingschat-web-sdk</w:t>
-      </w:r>
-      <w:r>
-        <w:t xml:space="preserve"> 0.1.x + our bridge issuer (KingsChat OAuth → ES256 JWT + JWKS).</w:t>
+        <w:t xml:space="preserve">(The idempotent-VA and retired-number lessons from LinkPay's own backend now live behind the gateway; the app no longer provisions accounts itself.)</w:t>
       </w:r>
     </w:p>
     <w:p>
@@ -1213,55 +1378,97 @@
         <w:spacing w:after="120" w:before="240"/>
       </w:pPr>
       <w:r>
-        <w:t xml:space="preserve">F2 — Account number per user · </w:t>
-      </w:r>
-      <w:r>
-        <w:rPr>
-          <w:b/>
-          <w:bCs/>
-        </w:rPr>
-        <w:t xml:space="preserve">PHASE 1, BUILD NOW</w:t>
-      </w:r>
-    </w:p>
-    <w:p>
-      <w:pPr>
-        <w:pStyle w:val="ListParagraph"/>
-        <w:numPr>
-          <w:ilvl w:val="0"/>
-          <w:numId w:val="1"/>
-        </w:numPr>
-        <w:spacing w:after="60"/>
-      </w:pPr>
-      <w:r>
-        <w:t xml:space="preserve">On onboarding completion (or first deposit intent), the backend provisions a </w:t>
-      </w:r>
-      <w:r>
-        <w:rPr>
-          <w:b/>
-          <w:bCs/>
-        </w:rPr>
-        <w:t xml:space="preserve">virtual account</w:t>
-      </w:r>
-      <w:r>
-        <w:t xml:space="preserve">: ensure provider customer (keyed by our userId as </w:t>
-      </w:r>
-      <w:r>
-        <w:rPr>
-          <w:rFonts w:ascii="Courier New" w:cs="Courier New" w:eastAsia="Courier New" w:hAnsi="Courier New"/>
-          <w:sz w:val="20"/>
-          <w:szCs w:val="20"/>
-        </w:rPr>
-        <w:t xml:space="preserve">customer_reference</w:t>
-      </w:r>
-      <w:r>
-        <w:t xml:space="preserve">) → create VA with a </w:t>
-      </w:r>
-      <w:r>
-        <w:rPr>
-          <w:b/>
-          <w:bCs/>
-        </w:rPr>
-        <w:t xml:space="preserve">stable per-user idempotency key</w:t>
+        <w:t xml:space="preserve">F3 — Fiat account: deposit, withdrawal, cross-border</w:t>
+      </w:r>
+    </w:p>
+    <w:p>
+      <w:pPr>
+        <w:pStyle w:val="ListParagraph"/>
+        <w:numPr>
+          <w:ilvl w:val="0"/>
+          <w:numId w:val="1"/>
+        </w:numPr>
+        <w:spacing w:after="60"/>
+      </w:pPr>
+      <w:r>
+        <w:rPr>
+          <w:b/>
+          <w:bCs/>
+        </w:rPr>
+        <w:t xml:space="preserve">Deposit</w:t>
+      </w:r>
+      <w:r>
+        <w:t xml:space="preserve">: bank transfer to the VA → provider webhook credits the ledger; push notification on arrival.</w:t>
+      </w:r>
+    </w:p>
+    <w:p>
+      <w:pPr>
+        <w:pStyle w:val="ListParagraph"/>
+        <w:numPr>
+          <w:ilvl w:val="0"/>
+          <w:numId w:val="1"/>
+        </w:numPr>
+        <w:spacing w:after="60"/>
+      </w:pPr>
+      <w:r>
+        <w:rPr>
+          <w:b/>
+          <w:bCs/>
+        </w:rPr>
+        <w:t xml:space="preserve">Withdrawal / send</w:t>
+      </w:r>
+      <w:r>
+        <w:t xml:space="preserve">: name-enquiry (account resolution) → PIN → payout via provider. Idempotency keys on every money-moving call; no timeouts on money-out POSTs (aborting manufactures ambiguous outcomes — retry safety comes from the idempotency key).</w:t>
+      </w:r>
+    </w:p>
+    <w:p>
+      <w:pPr>
+        <w:pStyle w:val="ListParagraph"/>
+        <w:numPr>
+          <w:ilvl w:val="0"/>
+          <w:numId w:val="1"/>
+        </w:numPr>
+        <w:spacing w:after="60"/>
+      </w:pPr>
+      <w:r>
+        <w:rPr>
+          <w:b/>
+          <w:bCs/>
+        </w:rPr>
+        <w:t xml:space="preserve">Cross-border</w:t>
+      </w:r>
+      <w:r>
+        <w:t xml:space="preserve">: two rails, chosen by corridor:</w:t>
+      </w:r>
+    </w:p>
+    <w:p>
+      <w:pPr>
+        <w:pStyle w:val="ListParagraph"/>
+        <w:numPr>
+          <w:ilvl w:val="1"/>
+          <w:numId w:val="1"/>
+        </w:numPr>
+        <w:spacing w:after="60"/>
+      </w:pPr>
+      <w:r>
+        <w:t xml:space="preserve">Provider payouts where supported (NG/GH/KE/ZA lineage from LinkPay).</w:t>
+      </w:r>
+    </w:p>
+    <w:p>
+      <w:pPr>
+        <w:pStyle w:val="ListParagraph"/>
+        <w:numPr>
+          <w:ilvl w:val="1"/>
+          <w:numId w:val="1"/>
+        </w:numPr>
+        <w:spacing w:after="60"/>
+      </w:pPr>
+      <w:r>
+        <w:rPr>
+          <w:b/>
+          <w:bCs/>
+        </w:rPr>
+        <w:t xml:space="preserve">Worldstreet remit rail</w:t>
       </w:r>
       <w:r>
         <w:t xml:space="preserve"> (</w:t>
@@ -1272,80 +1479,33 @@
           <w:sz w:val="20"/>
           <w:szCs w:val="20"/>
         </w:rPr>
-        <w:t xml:space="preserve">va&lt;userId&gt;v&lt;version&gt;</w:t>
-      </w:r>
-      <w:r>
-        <w:t xml:space="preserve">) so retries and concurrent calls can never mint duplicates → persist </w:t>
-      </w:r>
-      <w:r>
-        <w:rPr>
-          <w:rFonts w:ascii="Courier New" w:cs="Courier New" w:eastAsia="Courier New" w:hAnsi="Courier New"/>
-          <w:sz w:val="20"/>
-          <w:szCs w:val="20"/>
-        </w:rPr>
-        <w:t xml:space="preserve">vaId</w:t>
-      </w:r>
-      <w:r>
-        <w:t xml:space="preserve">, </w:t>
-      </w:r>
-      <w:r>
-        <w:rPr>
-          <w:rFonts w:ascii="Courier New" w:cs="Courier New" w:eastAsia="Courier New" w:hAnsi="Courier New"/>
-          <w:sz w:val="20"/>
-          <w:szCs w:val="20"/>
-        </w:rPr>
-        <w:t xml:space="preserve">vaAccountNumber</w:t>
-      </w:r>
-      <w:r>
-        <w:t xml:space="preserve">, </w:t>
-      </w:r>
-      <w:r>
-        <w:rPr>
-          <w:rFonts w:ascii="Courier New" w:cs="Courier New" w:eastAsia="Courier New" w:hAnsi="Courier New"/>
-          <w:sz w:val="20"/>
-          <w:szCs w:val="20"/>
-        </w:rPr>
-        <w:t xml:space="preserve">vaBankName</w:t>
-      </w:r>
-      <w:r>
-        <w:t xml:space="preserve"> on the user.</w:t>
-      </w:r>
-    </w:p>
-    <w:p>
-      <w:pPr>
-        <w:pStyle w:val="ListParagraph"/>
-        <w:numPr>
-          <w:ilvl w:val="0"/>
-          <w:numId w:val="1"/>
-        </w:numPr>
-        <w:spacing w:after="60"/>
-      </w:pPr>
-      <w:r>
-        <w:t xml:space="preserve">The version suffix in the idempotency key is the provider-migration escape hatch (LinkPay is on v2 after the 2026-07 Rubies migration); </w:t>
-      </w:r>
-      <w:r>
-        <w:rPr>
-          <w:rFonts w:ascii="Courier New" w:cs="Courier New" w:eastAsia="Courier New" w:hAnsi="Courier New"/>
-          <w:sz w:val="20"/>
-          <w:szCs w:val="20"/>
-        </w:rPr>
-        <w:t xml:space="preserve">previousVirtualAccounts</w:t>
-      </w:r>
-      <w:r>
-        <w:t xml:space="preserve"> keeps retired numbers resolving to the user forever, because old numbers stay printed on invoices and saved in payers' banking apps.</w:t>
-      </w:r>
-    </w:p>
-    <w:p>
-      <w:pPr>
-        <w:pStyle w:val="ListParagraph"/>
-        <w:numPr>
-          <w:ilvl w:val="0"/>
-          <w:numId w:val="1"/>
-        </w:numPr>
-        <w:spacing w:after="60"/>
-      </w:pPr>
-      <w:r>
-        <w:t xml:space="preserve">Surface: Receive screen shows account number + bank + copy button and a QR; @tag handles (3–15 chars, unique, cooldown-locked after rename) for in-app P2P.</w:t>
+        <w:t xml:space="preserve">/v1/payment</w:t>
+      </w:r>
+      <w:r>
+        <w:t xml:space="preserve"> on the gateway): quote → corridor/bank pick → settles from </w:t>
+      </w:r>
+      <w:r>
+        <w:rPr>
+          <w:b/>
+          <w:bCs/>
+        </w:rPr>
+        <w:t xml:space="preserve">USDC on Base</w:t>
+      </w:r>
+      <w:r>
+        <w:t xml:space="preserve">. Pricing comes from the provider quote (spread baked in — never invent a client-side fee; that bug already happened once).</w:t>
+      </w:r>
+    </w:p>
+    <w:p>
+      <w:pPr>
+        <w:pStyle w:val="ListParagraph"/>
+        <w:numPr>
+          <w:ilvl w:val="0"/>
+          <w:numId w:val="1"/>
+        </w:numPr>
+        <w:spacing w:after="60"/>
+      </w:pPr>
+      <w:r>
+        <w:t xml:space="preserve">Currency display: minor units end-to-end (kobo model), currency-tagged transactions.</w:t>
       </w:r>
     </w:p>
     <w:p>
@@ -1354,7 +1514,7 @@
         <w:spacing w:after="120" w:before="240"/>
       </w:pPr>
       <w:r>
-        <w:t xml:space="preserve">F3 — Fiat account: deposit, withdrawal, cross-border</w:t>
+        <w:t xml:space="preserve">F4 — Crypto account: deposit &amp; withdrawal (cross-chain)</w:t>
       </w:r>
     </w:p>
     <w:p>
@@ -1374,114 +1534,81 @@
         <w:t xml:space="preserve">Deposit</w:t>
       </w:r>
       <w:r>
-        <w:t xml:space="preserve">: bank transfer to the VA → provider webhook credits the ledger; push notification on arrival.</w:t>
-      </w:r>
-    </w:p>
-    <w:p>
-      <w:pPr>
-        <w:pStyle w:val="ListParagraph"/>
-        <w:numPr>
-          <w:ilvl w:val="0"/>
-          <w:numId w:val="1"/>
-        </w:numPr>
-        <w:spacing w:after="60"/>
-      </w:pPr>
-      <w:r>
-        <w:rPr>
-          <w:b/>
-          <w:bCs/>
-        </w:rPr>
-        <w:t xml:space="preserve">Withdrawal / send</w:t>
-      </w:r>
-      <w:r>
-        <w:t xml:space="preserve">: name-enquiry (account resolution) → PIN → payout via provider. Idempotency keys on every money-moving call; no timeouts on money-out POSTs (aborting manufactures ambiguous outcomes — retry safety comes from the idempotency key).</w:t>
-      </w:r>
-    </w:p>
-    <w:p>
-      <w:pPr>
-        <w:pStyle w:val="ListParagraph"/>
-        <w:numPr>
-          <w:ilvl w:val="0"/>
-          <w:numId w:val="1"/>
-        </w:numPr>
-        <w:spacing w:after="60"/>
-      </w:pPr>
-      <w:r>
-        <w:rPr>
-          <w:b/>
-          <w:bCs/>
-        </w:rPr>
-        <w:t xml:space="preserve">Cross-border</w:t>
-      </w:r>
-      <w:r>
-        <w:t xml:space="preserve">: two rails, chosen by corridor:</w:t>
-      </w:r>
-    </w:p>
-    <w:p>
-      <w:pPr>
-        <w:pStyle w:val="ListParagraph"/>
-        <w:numPr>
-          <w:ilvl w:val="1"/>
-          <w:numId w:val="1"/>
-        </w:numPr>
-        <w:spacing w:after="60"/>
-      </w:pPr>
-      <w:r>
-        <w:t xml:space="preserve">Provider payouts where supported (NG/GH/KE/ZA lineage from LinkPay).</w:t>
-      </w:r>
-    </w:p>
-    <w:p>
-      <w:pPr>
-        <w:pStyle w:val="ListParagraph"/>
-        <w:numPr>
-          <w:ilvl w:val="1"/>
-          <w:numId w:val="1"/>
-        </w:numPr>
-        <w:spacing w:after="60"/>
-      </w:pPr>
-      <w:r>
-        <w:rPr>
-          <w:b/>
-          <w:bCs/>
-        </w:rPr>
-        <w:t xml:space="preserve">Worldstreet remit rail</w:t>
-      </w:r>
-      <w:r>
-        <w:t xml:space="preserve"> (</w:t>
-      </w:r>
-      <w:r>
-        <w:rPr>
-          <w:rFonts w:ascii="Courier New" w:cs="Courier New" w:eastAsia="Courier New" w:hAnsi="Courier New"/>
-          <w:sz w:val="20"/>
-          <w:szCs w:val="20"/>
-        </w:rPr>
-        <w:t xml:space="preserve">/v1/payment</w:t>
-      </w:r>
-      <w:r>
-        <w:t xml:space="preserve"> on the gateway): quote → corridor/bank pick → settles from </w:t>
-      </w:r>
-      <w:r>
-        <w:rPr>
-          <w:b/>
-          <w:bCs/>
-        </w:rPr>
-        <w:t xml:space="preserve">USDC on Base</w:t>
-      </w:r>
-      <w:r>
-        <w:t xml:space="preserve">. Pricing comes from the provider quote (spread baked in — never invent a client-side fee; that bug already happened once).</w:t>
-      </w:r>
-    </w:p>
-    <w:p>
-      <w:pPr>
-        <w:pStyle w:val="ListParagraph"/>
-        <w:numPr>
-          <w:ilvl w:val="0"/>
-          <w:numId w:val="1"/>
-        </w:numPr>
-        <w:spacing w:after="60"/>
-      </w:pPr>
-      <w:r>
-        <w:t xml:space="preserve">Currency display: minor units end-to-end (kobo model), currency-tagged transactions.</w:t>
+        <w:t xml:space="preserve">: show the user's static addresses (EVM / Solana / Tron / Bitcoin) with network picker + QR. Crypto arriving there → </w:t>
+      </w:r>
+      <w:r>
+        <w:rPr>
+          <w:b/>
+          <w:bCs/>
+        </w:rPr>
+        <w:t xml:space="preserve">optimistic fill</w:t>
+      </w:r>
+      <w:r>
+        <w:t xml:space="preserve"> into fiat balance (§5). This is deposit-as-onramp.</w:t>
+      </w:r>
+    </w:p>
+    <w:p>
+      <w:pPr>
+        <w:pStyle w:val="ListParagraph"/>
+        <w:numPr>
+          <w:ilvl w:val="0"/>
+          <w:numId w:val="1"/>
+        </w:numPr>
+        <w:spacing w:after="60"/>
+      </w:pPr>
+      <w:r>
+        <w:rPr>
+          <w:b/>
+          <w:bCs/>
+        </w:rPr>
+        <w:t xml:space="preserve">Embedded wallets</w:t>
+      </w:r>
+      <w:r>
+        <w:t xml:space="preserve">: the Decane social-wallet ETH + SOL addresses hold on-chain assets for trading/games (Worldstreet perp margin, Last Man entries are on-chain plays). Balances shown in the crypto tab; USD-equivalent everywhere.</w:t>
+      </w:r>
+    </w:p>
+    <w:p>
+      <w:pPr>
+        <w:pStyle w:val="ListParagraph"/>
+        <w:numPr>
+          <w:ilvl w:val="0"/>
+          <w:numId w:val="1"/>
+        </w:numPr>
+        <w:spacing w:after="60"/>
+      </w:pPr>
+      <w:r>
+        <w:rPr>
+          <w:b/>
+          <w:bCs/>
+        </w:rPr>
+        <w:t xml:space="preserve">Withdrawal</w:t>
+      </w:r>
+      <w:r>
+        <w:t xml:space="preserve">: on-chain send from the social wallet (user signs via Decane, TEE-backed; </w:t>
+      </w:r>
+      <w:r>
+        <w:rPr>
+          <w:rFonts w:ascii="Courier New" w:cs="Courier New" w:eastAsia="Courier New" w:hAnsi="Courier New"/>
+          <w:sz w:val="20"/>
+          <w:szCs w:val="20"/>
+        </w:rPr>
+        <w:t xml:space="preserve">requireAssertionPerSignature</w:t>
+      </w:r>
+      <w:r>
+        <w:t xml:space="preserve"> for high-value sends), or offramp crypto→fiat→bank. Gas sponsorship: Ark's flow used Privy's EIP-7702 authorization signing — Decane exposes message/tx/Solana signing but documents no 7702 support, so the sponsored-gas path needs rework or plain user-paid gas (§8).</w:t>
+      </w:r>
+    </w:p>
+    <w:p>
+      <w:pPr>
+        <w:pStyle w:val="ListParagraph"/>
+        <w:numPr>
+          <w:ilvl w:val="0"/>
+          <w:numId w:val="1"/>
+        </w:numPr>
+        <w:spacing w:after="60"/>
+      </w:pPr>
+      <w:r>
+        <w:t xml:space="preserve">Refunds for failed conversions go to a configured refund address; failure states must be visible in activity, never silent.</w:t>
       </w:r>
     </w:p>
     <w:p>
@@ -1490,109 +1617,6 @@
         <w:spacing w:after="120" w:before="240"/>
       </w:pPr>
       <w:r>
-        <w:t xml:space="preserve">F4 — Crypto account: deposit &amp; withdrawal (cross-chain)</w:t>
-      </w:r>
-    </w:p>
-    <w:p>
-      <w:pPr>
-        <w:pStyle w:val="ListParagraph"/>
-        <w:numPr>
-          <w:ilvl w:val="0"/>
-          <w:numId w:val="1"/>
-        </w:numPr>
-        <w:spacing w:after="60"/>
-      </w:pPr>
-      <w:r>
-        <w:rPr>
-          <w:b/>
-          <w:bCs/>
-        </w:rPr>
-        <w:t xml:space="preserve">Deposit</w:t>
-      </w:r>
-      <w:r>
-        <w:t xml:space="preserve">: show the user's static addresses (EVM / Solana / Tron / Bitcoin) with network picker + QR. Crypto arriving there → </w:t>
-      </w:r>
-      <w:r>
-        <w:rPr>
-          <w:b/>
-          <w:bCs/>
-        </w:rPr>
-        <w:t xml:space="preserve">optimistic fill</w:t>
-      </w:r>
-      <w:r>
-        <w:t xml:space="preserve"> into fiat balance (§5). This is deposit-as-onramp.</w:t>
-      </w:r>
-    </w:p>
-    <w:p>
-      <w:pPr>
-        <w:pStyle w:val="ListParagraph"/>
-        <w:numPr>
-          <w:ilvl w:val="0"/>
-          <w:numId w:val="1"/>
-        </w:numPr>
-        <w:spacing w:after="60"/>
-      </w:pPr>
-      <w:r>
-        <w:rPr>
-          <w:b/>
-          <w:bCs/>
-        </w:rPr>
-        <w:t xml:space="preserve">Embedded wallets</w:t>
-      </w:r>
-      <w:r>
-        <w:t xml:space="preserve">: the Decane social-wallet ETH + SOL addresses hold on-chain assets for trading/games (Worldstreet perp margin, Last Man entries are on-chain plays). Balances shown in the crypto tab; USD-equivalent everywhere.</w:t>
-      </w:r>
-    </w:p>
-    <w:p>
-      <w:pPr>
-        <w:pStyle w:val="ListParagraph"/>
-        <w:numPr>
-          <w:ilvl w:val="0"/>
-          <w:numId w:val="1"/>
-        </w:numPr>
-        <w:spacing w:after="60"/>
-      </w:pPr>
-      <w:r>
-        <w:rPr>
-          <w:b/>
-          <w:bCs/>
-        </w:rPr>
-        <w:t xml:space="preserve">Withdrawal</w:t>
-      </w:r>
-      <w:r>
-        <w:t xml:space="preserve">: on-chain send from the social wallet (user signs via Decane, TEE-backed; </w:t>
-      </w:r>
-      <w:r>
-        <w:rPr>
-          <w:rFonts w:ascii="Courier New" w:cs="Courier New" w:eastAsia="Courier New" w:hAnsi="Courier New"/>
-          <w:sz w:val="20"/>
-          <w:szCs w:val="20"/>
-        </w:rPr>
-        <w:t xml:space="preserve">requireAssertionPerSignature</w:t>
-      </w:r>
-      <w:r>
-        <w:t xml:space="preserve"> for high-value sends), or offramp crypto→fiat→bank. Gas sponsorship: Ark's flow used Privy's EIP-7702 authorization signing — Decane exposes message/tx/Solana signing but documents no 7702 support, so the sponsored-gas path needs rework or plain user-paid gas (§8).</w:t>
-      </w:r>
-    </w:p>
-    <w:p>
-      <w:pPr>
-        <w:pStyle w:val="ListParagraph"/>
-        <w:numPr>
-          <w:ilvl w:val="0"/>
-          <w:numId w:val="1"/>
-        </w:numPr>
-        <w:spacing w:after="60"/>
-      </w:pPr>
-      <w:r>
-        <w:t xml:space="preserve">Refunds for failed conversions go to a configured refund address; failure states must be visible in activity, never silent.</w:t>
-      </w:r>
-    </w:p>
-    <w:p>
-      <w:pPr>
-        <w:pStyle w:val="Heading3"/>
-        <w:spacing w:after="120" w:before="240"/>
-      </w:pPr>
-      <w:r>
         <w:t xml:space="preserve">F5 — The optimistic-fill ledger (why balance feels instant)</w:t>
       </w:r>
     </w:p>
@@ -1609,7 +1633,7 @@
         <w:pStyle w:val="ListParagraph"/>
         <w:numPr>
           <w:ilvl w:val="0"/>
-          <w:numId w:val="5"/>
+          <w:numId w:val="3"/>
         </w:numPr>
         <w:spacing w:after="60"/>
       </w:pPr>
@@ -1630,7 +1654,7 @@
         <w:pStyle w:val="ListParagraph"/>
         <w:numPr>
           <w:ilvl w:val="0"/>
-          <w:numId w:val="5"/>
+          <w:numId w:val="3"/>
         </w:numPr>
         <w:spacing w:after="60"/>
       </w:pPr>
@@ -1705,7 +1729,7 @@
         <w:pStyle w:val="ListParagraph"/>
         <w:numPr>
           <w:ilvl w:val="0"/>
-          <w:numId w:val="5"/>
+          <w:numId w:val="3"/>
         </w:numPr>
         <w:spacing w:after="60"/>
       </w:pPr>
@@ -2406,123 +2430,127 @@
         <w:t xml:space="preserve">Backend</w:t>
       </w:r>
       <w:r>
-        <w:t xml:space="preserve">: new </w:t>
-      </w:r>
-      <w:r>
-        <w:rPr>
-          <w:rFonts w:ascii="Courier New" w:cs="Courier New" w:eastAsia="Courier New" w:hAnsi="Courier New"/>
-          <w:sz w:val="20"/>
-          <w:szCs w:val="20"/>
-        </w:rPr>
-        <w:t xml:space="preserve">primal-be</w:t>
-      </w:r>
-      <w:r>
-        <w:t xml:space="preserve"> service cloned from </w:t>
-      </w:r>
-      <w:r>
-        <w:rPr>
-          <w:rFonts w:ascii="Courier New" w:cs="Courier New" w:eastAsia="Courier New" w:hAnsi="Courier New"/>
-          <w:sz w:val="20"/>
-          <w:szCs w:val="20"/>
-        </w:rPr>
-        <w:t xml:space="preserve">pouchpay-be</w:t>
-      </w:r>
-      <w:r>
-        <w:t xml:space="preserve">'s architecture (Bun + Express + Mongoose + Zod, module-per-domain, webhook module, reconcile/backfill jobs) — swap the auth module's root of trust to Decane token verification (</w:t>
-      </w:r>
-      <w:r>
-        <w:rPr>
-          <w:rFonts w:ascii="Courier New" w:cs="Courier New" w:eastAsia="Courier New" w:hAnsi="Courier New"/>
-          <w:sz w:val="20"/>
-          <w:szCs w:val="20"/>
-        </w:rPr>
-        <w:t xml:space="preserve">decane-node</w:t>
-      </w:r>
-      <w:r>
-        <w:t xml:space="preserve">), plus the small </w:t>
-      </w:r>
-      <w:r>
-        <w:rPr>
-          <w:b/>
-          <w:bCs/>
-        </w:rPr>
-        <w:t xml:space="preserve">KingsChat bridge issuer</w:t>
-      </w:r>
-      <w:r>
-        <w:t xml:space="preserve"> (KingsChat OAuth verify → mint ES256 JWT, publish JWKS) which can live as a module inside </w:t>
-      </w:r>
-      <w:r>
-        <w:rPr>
-          <w:rFonts w:ascii="Courier New" w:cs="Courier New" w:eastAsia="Courier New" w:hAnsi="Courier New"/>
-          <w:sz w:val="20"/>
-          <w:szCs w:val="20"/>
-        </w:rPr>
-        <w:t xml:space="preserve">primal-be</w:t>
-      </w:r>
-      <w:r>
-        <w:t xml:space="preserve">.</w:t>
-      </w:r>
-    </w:p>
-    <w:p>
-      <w:pPr>
-        <w:pStyle w:val="ListParagraph"/>
-        <w:numPr>
-          <w:ilvl w:val="0"/>
-          <w:numId w:val="1"/>
-        </w:numPr>
-        <w:spacing w:after="60"/>
-      </w:pPr>
-      <w:r>
-        <w:rPr>
-          <w:b/>
-          <w:bCs/>
-        </w:rPr>
-        <w:t xml:space="preserve">Auth surface</w:t>
-      </w:r>
-      <w:r>
-        <w:t xml:space="preserve">: a minimal hosted web page running </w:t>
-      </w:r>
-      <w:r>
-        <w:rPr>
-          <w:rFonts w:ascii="Courier New" w:cs="Courier New" w:eastAsia="Courier New" w:hAnsi="Courier New"/>
-          <w:sz w:val="20"/>
-          <w:szCs w:val="20"/>
-        </w:rPr>
-        <w:t xml:space="preserve">decane-connect-kit</w:t>
-      </w:r>
-      <w:r>
-        <w:t xml:space="preserve"> (login + wallet signing), opened from the app via </w:t>
-      </w:r>
-      <w:r>
-        <w:rPr>
-          <w:rFonts w:ascii="Courier New" w:cs="Courier New" w:eastAsia="Courier New" w:hAnsi="Courier New"/>
-          <w:sz w:val="20"/>
-          <w:szCs w:val="20"/>
-        </w:rPr>
-        <w:t xml:space="preserve">expo-auth-session</w:t>
-      </w:r>
-      <w:r>
-        <w:t xml:space="preserve"> — required because Decane has no RN SDK today (§F1).</w:t>
-      </w:r>
-    </w:p>
-    <w:p>
-      <w:pPr>
-        <w:pStyle w:val="ListParagraph"/>
-        <w:numPr>
-          <w:ilvl w:val="0"/>
-          <w:numId w:val="1"/>
-        </w:numPr>
-        <w:spacing w:after="60"/>
-      </w:pPr>
-      <w:r>
-        <w:rPr>
-          <w:b/>
-          <w:bCs/>
-        </w:rPr>
-        <w:t xml:space="preserve">Providers</w:t>
-      </w:r>
-      <w:r>
-        <w:t xml:space="preserve">: Liquifia (VAs, payouts, static addresses, optimistic fill, bills), Worldstreet gateway (perp, remit, earn, prediction/RWA, games infra), Decane (identity + non-custodial social wallets), KingsChat (OAuth identity).</w:t>
+        <w:t xml:space="preserve">: the </w:t>
+      </w:r>
+      <w:r>
+        <w:rPr>
+          <w:b/>
+          <w:bCs/>
+        </w:rPr>
+        <w:t xml:space="preserve">Primal API Gateway</w:t>
+      </w:r>
+      <w:r>
+        <w:t xml:space="preserve"> at </w:t>
+      </w:r>
+      <w:r>
+        <w:rPr>
+          <w:rFonts w:ascii="Courier New" w:cs="Courier New" w:eastAsia="Courier New" w:hAnsi="Courier New"/>
+          <w:sz w:val="20"/>
+          <w:szCs w:val="20"/>
+        </w:rPr>
+        <w:t xml:space="preserve">https://api.tsion.io</w:t>
+      </w:r>
+      <w:r>
+        <w:t xml:space="preserve"> (contract: </w:t>
+      </w:r>
+      <w:r>
+        <w:rPr>
+          <w:rFonts w:ascii="Courier New" w:cs="Courier New" w:eastAsia="Courier New" w:hAnsi="Courier New"/>
+          <w:sz w:val="20"/>
+          <w:szCs w:val="20"/>
+        </w:rPr>
+        <w:t xml:space="preserve">/openapi.json</w:t>
+      </w:r>
+      <w:r>
+        <w:t xml:space="preserve">, which is authoritative over any document including this one). It fronts User Management, Subscription and LinkPay over private gRPC; the app never talks to those services, a database, a queue, or a provider directly. </w:t>
+      </w:r>
+      <w:r>
+        <w:rPr>
+          <w:b/>
+          <w:bCs/>
+        </w:rPr>
+        <w:t xml:space="preserve">Paradigm owns no backend of its own.</w:t>
+      </w:r>
+    </w:p>
+    <w:p>
+      <w:pPr>
+        <w:pStyle w:val="ListParagraph"/>
+        <w:numPr>
+          <w:ilvl w:val="0"/>
+          <w:numId w:val="1"/>
+        </w:numPr>
+        <w:spacing w:after="60"/>
+      </w:pPr>
+      <w:r>
+        <w:rPr>
+          <w:b/>
+          <w:bCs/>
+        </w:rPr>
+        <w:t xml:space="preserve">Auth</w:t>
+      </w:r>
+      <w:r>
+        <w:t xml:space="preserve">: native </w:t>
+      </w:r>
+      <w:r>
+        <w:rPr>
+          <w:rFonts w:ascii="Courier New" w:cs="Courier New" w:eastAsia="Courier New" w:hAnsi="Courier New"/>
+          <w:sz w:val="20"/>
+          <w:szCs w:val="20"/>
+        </w:rPr>
+        <w:t xml:space="preserve">decane-connect-kit-expo</w:t>
+      </w:r>
+      <w:r>
+        <w:t xml:space="preserve"> in the app (wallet + signing), SIWE against the gateway for the session (§F1). No hosted web surface, no bridge service — both were designed around constraints that no longer exist.</w:t>
+      </w:r>
+    </w:p>
+    <w:p>
+      <w:pPr>
+        <w:pStyle w:val="ListParagraph"/>
+        <w:numPr>
+          <w:ilvl w:val="0"/>
+          <w:numId w:val="1"/>
+        </w:numPr>
+        <w:spacing w:after="60"/>
+      </w:pPr>
+      <w:r>
+        <w:rPr>
+          <w:b/>
+          <w:bCs/>
+        </w:rPr>
+        <w:t xml:space="preserve">Providers, and who talks to them</w:t>
+      </w:r>
+      <w:r>
+        <w:t xml:space="preserve">: the gateway owns LinkPay (accounts, deposits, withdrawals, bills) and Dextopus (subscription checkout) with its own credentials. The app talks directly to the </w:t>
+      </w:r>
+      <w:r>
+        <w:rPr>
+          <w:b/>
+          <w:bCs/>
+        </w:rPr>
+        <w:t xml:space="preserve">Worldstreet/Ark rails</w:t>
+      </w:r>
+      <w:r>
+        <w:t xml:space="preserve"> the gateway does not implement — perp, remit, earn, the King of Night vault (games) — and to public RPC/Alchemy for wallet balances.</w:t>
+      </w:r>
+    </w:p>
+    <w:p>
+      <w:pPr>
+        <w:pStyle w:val="ListParagraph"/>
+        <w:numPr>
+          <w:ilvl w:val="0"/>
+          <w:numId w:val="1"/>
+        </w:numPr>
+        <w:spacing w:after="60"/>
+      </w:pPr>
+      <w:r>
+        <w:rPr>
+          <w:b/>
+          <w:bCs/>
+        </w:rPr>
+        <w:t xml:space="preserve">Not implemented on the gateway</w:t>
+      </w:r>
+      <w:r>
+        <w:t xml:space="preserve"> (per its own docs): ARK and WorldStreet product routes. Those stay app-side until the backend exposes them.</w:t>
       </w:r>
     </w:p>
     <w:p>
@@ -3092,7 +3120,7 @@
         <w:pStyle w:val="ListParagraph"/>
         <w:numPr>
           <w:ilvl w:val="0"/>
-          <w:numId w:val="6"/>
+          <w:numId w:val="4"/>
         </w:numPr>
         <w:spacing w:after="60"/>
       </w:pPr>
@@ -3115,7 +3143,7 @@
         <w:pStyle w:val="ListParagraph"/>
         <w:numPr>
           <w:ilvl w:val="0"/>
-          <w:numId w:val="6"/>
+          <w:numId w:val="4"/>
         </w:numPr>
         <w:spacing w:after="60"/>
       </w:pPr>
@@ -3128,7 +3156,7 @@
         <w:pStyle w:val="ListParagraph"/>
         <w:numPr>
           <w:ilvl w:val="0"/>
-          <w:numId w:val="6"/>
+          <w:numId w:val="4"/>
         </w:numPr>
         <w:spacing w:after="60"/>
       </w:pPr>
@@ -3141,7 +3169,7 @@
         <w:pStyle w:val="ListParagraph"/>
         <w:numPr>
           <w:ilvl w:val="0"/>
-          <w:numId w:val="6"/>
+          <w:numId w:val="4"/>
         </w:numPr>
         <w:spacing w:after="60"/>
       </w:pPr>
@@ -3154,7 +3182,7 @@
         <w:pStyle w:val="ListParagraph"/>
         <w:numPr>
           <w:ilvl w:val="0"/>
-          <w:numId w:val="6"/>
+          <w:numId w:val="4"/>
         </w:numPr>
         <w:spacing w:after="60"/>
       </w:pPr>
@@ -3167,7 +3195,7 @@
         <w:pStyle w:val="ListParagraph"/>
         <w:numPr>
           <w:ilvl w:val="0"/>
-          <w:numId w:val="6"/>
+          <w:numId w:val="4"/>
         </w:numPr>
         <w:spacing w:after="60"/>
       </w:pPr>
@@ -3180,7 +3208,7 @@
         <w:pStyle w:val="ListParagraph"/>
         <w:numPr>
           <w:ilvl w:val="0"/>
-          <w:numId w:val="6"/>
+          <w:numId w:val="4"/>
         </w:numPr>
         <w:spacing w:after="60"/>
       </w:pPr>
@@ -3193,7 +3221,7 @@
         <w:pStyle w:val="ListParagraph"/>
         <w:numPr>
           <w:ilvl w:val="0"/>
-          <w:numId w:val="6"/>
+          <w:numId w:val="4"/>
         </w:numPr>
         <w:spacing w:after="60"/>
       </w:pPr>
@@ -3206,7 +3234,7 @@
         <w:pStyle w:val="ListParagraph"/>
         <w:numPr>
           <w:ilvl w:val="0"/>
-          <w:numId w:val="6"/>
+          <w:numId w:val="4"/>
         </w:numPr>
         <w:spacing w:after="60"/>
       </w:pPr>
@@ -3311,7 +3339,7 @@
                 <w:b/>
                 <w:bCs/>
               </w:rPr>
-              <w:t xml:space="preserve">Definition of done</w:t>
+              <w:t xml:space="preserve">Status</w:t>
             </w:r>
           </w:p>
         </w:tc>
@@ -3336,7 +3364,7 @@
                 <w:b/>
                 <w:bCs/>
               </w:rPr>
-              <w:t xml:space="preserve">1 — NOW</w:t>
+              <w:t xml:space="preserve">1 — Auth</w:t>
             </w:r>
           </w:p>
         </w:tc>
@@ -3352,43 +3380,30 @@
           </w:tcPr>
           <w:p>
             <w:r>
-              <w:t xml:space="preserve">Decane auth end-to-end (</w:t>
-            </w:r>
+              <w:t xml:space="preserve">Decane wallet (KingsChat/Google/email) + SIWE session against the gateway + PIN/passkey onboarding</w:t>
+            </w:r>
+          </w:p>
+        </w:tc>
+        <w:tc>
+          <w:tcPr>
+            <w:tcW w:type="dxa" w:w="3360"/>
+            <w:tcMar>
+              <w:top w:type="dxa" w:w="60"/>
+              <w:left w:type="dxa" w:w="100"/>
+              <w:bottom w:type="dxa" w:w="60"/>
+              <w:right w:type="dxa" w:w="100"/>
+            </w:tcMar>
+          </w:tcPr>
+          <w:p>
             <w:r>
               <w:rPr>
                 <w:b/>
                 <w:bCs/>
               </w:rPr>
-              <w:t xml:space="preserve">KingsChat bridge</w:t>
-            </w:r>
-            <w:r>
-              <w:t xml:space="preserve"> + Google/email, hosted auth surface) + backend session exchange + user model + </w:t>
-            </w:r>
-            <w:r>
-              <w:rPr>
-                <w:b/>
-                <w:bCs/>
-              </w:rPr>
-              <w:t xml:space="preserve">VA provisioning (account number per user)</w:t>
-            </w:r>
-            <w:r>
-              <w:t xml:space="preserve"> + onboarding UI</w:t>
-            </w:r>
-          </w:p>
-        </w:tc>
-        <w:tc>
-          <w:tcPr>
-            <w:tcW w:type="dxa" w:w="3360"/>
-            <w:tcMar>
-              <w:top w:type="dxa" w:w="60"/>
-              <w:left w:type="dxa" w:w="100"/>
-              <w:bottom w:type="dxa" w:w="60"/>
-              <w:right w:type="dxa" w:w="100"/>
-            </w:tcMar>
-          </w:tcPr>
-          <w:p>
-            <w:r>
-              <w:t xml:space="preserve">Sign in with KingsChat on a device → see your own account number on the Receive screen</w:t>
+              <w:t xml:space="preserve">Done.</w:t>
+            </w:r>
+            <w:r>
+              <w:t xml:space="preserve"> Signs in on a dev build; wallet addresses real; session survives cold launch.</w:t>
             </w:r>
           </w:p>
         </w:tc>
@@ -3409,7 +3424,11 @@
           </w:tcPr>
           <w:p>
             <w:r>
-              <w:t xml:space="preserve">2</w:t>
+              <w:rPr>
+                <w:b/>
+                <w:bCs/>
+              </w:rPr>
+              <w:t xml:space="preserve">2 — Membership</w:t>
             </w:r>
           </w:p>
         </w:tc>
@@ -3425,7 +3444,7 @@
           </w:tcPr>
           <w:p>
             <w:r>
-              <w:t xml:space="preserve">Fiat rails: deposit webhook → ledger → activity feed; send/withdraw with PIN; transaction history</w:t>
+              <w:t xml:space="preserve">Subscription checkout ($1,000/mo, Dextopus deposit address), payment polling, entitlement-sync window, renewal</w:t>
             </w:r>
           </w:p>
         </w:tc>
@@ -3441,7 +3460,14 @@
           </w:tcPr>
           <w:p>
             <w:r>
-              <w:t xml:space="preserve">Money in via bank transfer shows in-app in &lt;10s; money out settles with idempotent safety</w:t>
+              <w:rPr>
+                <w:b/>
+                <w:bCs/>
+              </w:rPr>
+              <w:t xml:space="preserve">In build.</w:t>
+            </w:r>
+            <w:r>
+              <w:t xml:space="preserve"> Nothing behind the paywall works until this ships — it gates every LinkPay route.</w:t>
             </w:r>
           </w:p>
         </w:tc>
@@ -3462,7 +3488,11 @@
           </w:tcPr>
           <w:p>
             <w:r>
-              <w:t xml:space="preserve">3</w:t>
+              <w:rPr>
+                <w:b/>
+                <w:bCs/>
+              </w:rPr>
+              <w:t xml:space="preserve">3 — Fiat</w:t>
             </w:r>
           </w:p>
         </w:tc>
@@ -3478,7 +3508,7 @@
           </w:tcPr>
           <w:p>
             <w:r>
-              <w:t xml:space="preserve">Crypto: static deposit addresses + optimistic fill + embedded-wallet balances + on-chain send</w:t>
+              <w:t xml:space="preserve">KYC account provisioning, balance, deposits feed, bank withdrawal (validate → quote → initiate → poll)</w:t>
             </w:r>
           </w:p>
         </w:tc>
@@ -3494,7 +3524,14 @@
           </w:tcPr>
           <w:p>
             <w:r>
-              <w:t xml:space="preserve">Crypto deposit credits fiat balance optimistically; failure → refund path visible</w:t>
+              <w:rPr>
+                <w:b/>
+                <w:bCs/>
+              </w:rPr>
+              <w:t xml:space="preserve">In build</w:t>
+            </w:r>
+            <w:r>
+              <w:t xml:space="preserve">, against the gateway.</w:t>
             </w:r>
           </w:p>
         </w:tc>
@@ -3515,7 +3552,11 @@
           </w:tcPr>
           <w:p>
             <w:r>
-              <w:t xml:space="preserve">4</w:t>
+              <w:rPr>
+                <w:b/>
+                <w:bCs/>
+              </w:rPr>
+              <w:t xml:space="preserve">4 — Crypto</w:t>
             </w:r>
           </w:p>
         </w:tc>
@@ -3531,7 +3572,7 @@
           </w:tcPr>
           <w:p>
             <w:r>
-              <w:t xml:space="preserve">Cross-border (both rails) + Earn integration</w:t>
+              <w:t xml:space="preserve">Wallet balances (live), minted deposit addresses, spot buy/sell via Dextopus, on-chain send</w:t>
             </w:r>
           </w:p>
         </w:tc>
@@ -3547,7 +3588,7 @@
           </w:tcPr>
           <w:p>
             <w:r>
-              <w:t xml:space="preserve">Live corridor quote → payout; bounty feed authenticated by Decane token (needs §7.3)</w:t>
+              <w:t xml:space="preserve">Balances done; deposit + swap rails in build. Solana sends still refuse honestly.</w:t>
             </w:r>
           </w:p>
         </w:tc>
@@ -3568,30 +3609,27 @@
           </w:tcPr>
           <w:p>
             <w:r>
-              <w:t xml:space="preserve">5</w:t>
-            </w:r>
-          </w:p>
-        </w:tc>
-        <w:tc>
-          <w:tcPr>
-            <w:tcW w:type="dxa" w:w="4300"/>
-            <w:tcMar>
-              <w:top w:type="dxa" w:w="60"/>
-              <w:left w:type="dxa" w:w="100"/>
-              <w:bottom w:type="dxa" w:w="60"/>
-              <w:right w:type="dxa" w:w="100"/>
-            </w:tcMar>
-          </w:tcPr>
-          <w:p>
-            <w:r>
-              <w:t xml:space="preserve">Games (Last Man @ $50) + copy trading </w:t>
-            </w:r>
-            <w:r>
               <w:rPr>
                 <w:b/>
                 <w:bCs/>
               </w:rPr>
-              <w:t xml:space="preserve">(gated on Worldstreet endpoints)</w:t>
+              <w:t xml:space="preserve">5 — Games</w:t>
+            </w:r>
+          </w:p>
+        </w:tc>
+        <w:tc>
+          <w:tcPr>
+            <w:tcW w:type="dxa" w:w="4300"/>
+            <w:tcMar>
+              <w:top w:type="dxa" w:w="60"/>
+              <w:left w:type="dxa" w:w="100"/>
+              <w:bottom w:type="dxa" w:w="60"/>
+              <w:right w:type="dxa" w:w="100"/>
+            </w:tcMar>
+          </w:tcPr>
+          <w:p>
+            <w:r>
+              <w:t xml:space="preserve">Last Man Standing on the v4 vault, $50 stake policy, claims</w:t>
             </w:r>
           </w:p>
         </w:tc>
@@ -3607,7 +3645,128 @@
           </w:tcPr>
           <w:p>
             <w:r>
-              <w:t xml:space="preserve">First round completes with real claims; first mirrored trade</w:t>
+              <w:t xml:space="preserve">Rails + screen done and live against the vault gateway; awaiting a first real round.</w:t>
+            </w:r>
+          </w:p>
+        </w:tc>
+      </w:tr>
+      <w:tr>
+        <w:trPr>
+          <w:tblHeader w:val="false"/>
+        </w:trPr>
+        <w:tc>
+          <w:tcPr>
+            <w:tcW w:type="dxa" w:w="1700"/>
+            <w:tcMar>
+              <w:top w:type="dxa" w:w="60"/>
+              <w:left w:type="dxa" w:w="100"/>
+              <w:bottom w:type="dxa" w:w="60"/>
+              <w:right w:type="dxa" w:w="100"/>
+            </w:tcMar>
+          </w:tcPr>
+          <w:p>
+            <w:r>
+              <w:rPr>
+                <w:b/>
+                <w:bCs/>
+              </w:rPr>
+              <w:t xml:space="preserve">6 — Bills &amp; VAS</w:t>
+            </w:r>
+          </w:p>
+        </w:tc>
+        <w:tc>
+          <w:tcPr>
+            <w:tcW w:type="dxa" w:w="4300"/>
+            <w:tcMar>
+              <w:top w:type="dxa" w:w="60"/>
+              <w:left w:type="dxa" w:w="100"/>
+              <w:bottom w:type="dxa" w:w="60"/>
+              <w:right w:type="dxa" w:w="100"/>
+            </w:tcMar>
+          </w:tcPr>
+          <w:p>
+            <w:r>
+              <w:t xml:space="preserve">Airtime, data, electricity, TV via the gateway</w:t>
+            </w:r>
+          </w:p>
+        </w:tc>
+        <w:tc>
+          <w:tcPr>
+            <w:tcW w:type="dxa" w:w="3360"/>
+            <w:tcMar>
+              <w:top w:type="dxa" w:w="60"/>
+              <w:left w:type="dxa" w:w="100"/>
+              <w:bottom w:type="dxa" w:w="60"/>
+              <w:right w:type="dxa" w:w="100"/>
+            </w:tcMar>
+          </w:tcPr>
+          <w:p>
+            <w:r>
+              <w:t xml:space="preserve">In build.</w:t>
+            </w:r>
+          </w:p>
+        </w:tc>
+      </w:tr>
+      <w:tr>
+        <w:trPr>
+          <w:tblHeader w:val="false"/>
+        </w:trPr>
+        <w:tc>
+          <w:tcPr>
+            <w:tcW w:type="dxa" w:w="1700"/>
+            <w:tcMar>
+              <w:top w:type="dxa" w:w="60"/>
+              <w:left w:type="dxa" w:w="100"/>
+              <w:bottom w:type="dxa" w:w="60"/>
+              <w:right w:type="dxa" w:w="100"/>
+            </w:tcMar>
+          </w:tcPr>
+          <w:p>
+            <w:r>
+              <w:rPr>
+                <w:b/>
+                <w:bCs/>
+              </w:rPr>
+              <w:t xml:space="preserve">7 — Worldstreet</w:t>
+            </w:r>
+          </w:p>
+        </w:tc>
+        <w:tc>
+          <w:tcPr>
+            <w:tcW w:type="dxa" w:w="4300"/>
+            <w:tcMar>
+              <w:top w:type="dxa" w:w="60"/>
+              <w:left w:type="dxa" w:w="100"/>
+              <w:bottom w:type="dxa" w:w="60"/>
+              <w:right w:type="dxa" w:w="100"/>
+            </w:tcMar>
+          </w:tcPr>
+          <w:p>
+            <w:r>
+              <w:t xml:space="preserve">Copy trading, Earn/Kash</w:t>
+            </w:r>
+          </w:p>
+        </w:tc>
+        <w:tc>
+          <w:tcPr>
+            <w:tcW w:type="dxa" w:w="3360"/>
+            <w:tcMar>
+              <w:top w:type="dxa" w:w="60"/>
+              <w:left w:type="dxa" w:w="100"/>
+              <w:bottom w:type="dxa" w:w="60"/>
+              <w:right w:type="dxa" w:w="100"/>
+            </w:tcMar>
+          </w:tcPr>
+          <w:p>
+            <w:r>
+              <w:rPr>
+                <w:b/>
+                <w:bCs/>
+              </w:rPr>
+              <w:t xml:space="preserve">Blocked</w:t>
+            </w:r>
+            <w:r>
+              <w:t xml:space="preserve">: no gateway routes, and copy-trading endpoints do not exist anywhere yet (§7.1).</w:t>
             </w:r>
           </w:p>
         </w:tc>
@@ -3640,7 +3799,7 @@
         <w:pStyle w:val="ListParagraph"/>
         <w:numPr>
           <w:ilvl w:val="0"/>
-          <w:numId w:val="7"/>
+          <w:numId w:val="5"/>
         </w:numPr>
         <w:spacing w:after="60"/>
       </w:pPr>
@@ -3660,7 +3819,7 @@
         <w:pStyle w:val="ListParagraph"/>
         <w:numPr>
           <w:ilvl w:val="0"/>
-          <w:numId w:val="7"/>
+          <w:numId w:val="5"/>
         </w:numPr>
         <w:spacing w:after="60"/>
       </w:pPr>
@@ -3680,7 +3839,7 @@
         <w:pStyle w:val="ListParagraph"/>
         <w:numPr>
           <w:ilvl w:val="0"/>
-          <w:numId w:val="7"/>
+          <w:numId w:val="5"/>
         </w:numPr>
         <w:spacing w:after="60"/>
       </w:pPr>
@@ -3711,7 +3870,7 @@
         <w:pStyle w:val="ListParagraph"/>
         <w:numPr>
           <w:ilvl w:val="0"/>
-          <w:numId w:val="7"/>
+          <w:numId w:val="5"/>
         </w:numPr>
         <w:spacing w:after="60"/>
       </w:pPr>
@@ -3724,7 +3883,7 @@
         <w:pStyle w:val="ListParagraph"/>
         <w:numPr>
           <w:ilvl w:val="0"/>
-          <w:numId w:val="7"/>
+          <w:numId w:val="5"/>
         </w:numPr>
         <w:spacing w:after="60"/>
       </w:pPr>
@@ -3748,7 +3907,7 @@
         <w:pStyle w:val="ListParagraph"/>
         <w:numPr>
           <w:ilvl w:val="0"/>
-          <w:numId w:val="7"/>
+          <w:numId w:val="5"/>
         </w:numPr>
         <w:spacing w:after="60"/>
       </w:pPr>
@@ -3770,7 +3929,7 @@
         <w:pStyle w:val="ListParagraph"/>
         <w:numPr>
           <w:ilvl w:val="0"/>
-          <w:numId w:val="8"/>
+          <w:numId w:val="6"/>
         </w:numPr>
         <w:spacing w:after="60"/>
       </w:pPr>
@@ -3790,7 +3949,7 @@
         <w:pStyle w:val="ListParagraph"/>
         <w:numPr>
           <w:ilvl w:val="0"/>
-          <w:numId w:val="8"/>
+          <w:numId w:val="6"/>
         </w:numPr>
         <w:spacing w:after="60"/>
       </w:pPr>
@@ -3821,7 +3980,7 @@
         <w:pStyle w:val="ListParagraph"/>
         <w:numPr>
           <w:ilvl w:val="0"/>
-          <w:numId w:val="8"/>
+          <w:numId w:val="6"/>
         </w:numPr>
         <w:spacing w:after="60"/>
       </w:pPr>
@@ -3841,7 +4000,7 @@
         <w:pStyle w:val="ListParagraph"/>
         <w:numPr>
           <w:ilvl w:val="0"/>
-          <w:numId w:val="8"/>
+          <w:numId w:val="6"/>
         </w:numPr>
         <w:spacing w:after="60"/>
       </w:pPr>
@@ -3861,7 +4020,7 @@
         <w:pStyle w:val="ListParagraph"/>
         <w:numPr>
           <w:ilvl w:val="0"/>
-          <w:numId w:val="8"/>
+          <w:numId w:val="6"/>
         </w:numPr>
         <w:spacing w:after="60"/>
       </w:pPr>
@@ -3874,7 +4033,7 @@
         <w:pStyle w:val="ListParagraph"/>
         <w:numPr>
           <w:ilvl w:val="0"/>
-          <w:numId w:val="8"/>
+          <w:numId w:val="6"/>
         </w:numPr>
         <w:spacing w:after="60"/>
       </w:pPr>
@@ -3887,7 +4046,7 @@
         <w:pStyle w:val="ListParagraph"/>
         <w:numPr>
           <w:ilvl w:val="0"/>
-          <w:numId w:val="8"/>
+          <w:numId w:val="6"/>
         </w:numPr>
         <w:spacing w:after="60"/>
       </w:pPr>
@@ -3900,7 +4059,7 @@
         <w:pStyle w:val="ListParagraph"/>
         <w:numPr>
           <w:ilvl w:val="0"/>
-          <w:numId w:val="8"/>
+          <w:numId w:val="6"/>
         </w:numPr>
         <w:spacing w:after="60"/>
       </w:pPr>
@@ -4131,30 +4290,6 @@
     </w:lvl>
   </w:abstractNum>
   <w:abstractNum w:abstractNumId="6" w15:restartNumberingAfterBreak="0">
-    <w:multiLevelType w:val="hybridMultilevel"/>
-    <w:lvl w:ilvl="0" w15:tentative="1">
-      <w:start w:val="1"/>
-      <w:numFmt w:val="decimal"/>
-      <w:lvlText w:val="%1."/>
-      <w:lvlJc w:val="start"/>
-      <w:pPr>
-        <w:ind w:left="540" w:hanging="300"/>
-      </w:pPr>
-    </w:lvl>
-  </w:abstractNum>
-  <w:abstractNum w:abstractNumId="7" w15:restartNumberingAfterBreak="0">
-    <w:multiLevelType w:val="hybridMultilevel"/>
-    <w:lvl w:ilvl="0" w15:tentative="1">
-      <w:start w:val="1"/>
-      <w:numFmt w:val="decimal"/>
-      <w:lvlText w:val="%1."/>
-      <w:lvlJc w:val="start"/>
-      <w:pPr>
-        <w:ind w:left="540" w:hanging="300"/>
-      </w:pPr>
-    </w:lvl>
-  </w:abstractNum>
-  <w:abstractNum w:abstractNumId="8" w15:restartNumberingAfterBreak="0">
     <w:multiLevelType w:val="hybridMultilevel"/>
     <w:lvl w:ilvl="0" w15:tentative="1">
       <w:start w:val="1"/>
@@ -4198,18 +4333,6 @@
   </w:num>
   <w:num w:numId="6">
     <w:abstractNumId w:val="6"/>
-    <w:lvlOverride w:ilvl="0">
-      <w:startOverride w:val="1"/>
-    </w:lvlOverride>
-  </w:num>
-  <w:num w:numId="7">
-    <w:abstractNumId w:val="7"/>
-    <w:lvlOverride w:ilvl="0">
-      <w:startOverride w:val="1"/>
-    </w:lvlOverride>
-  </w:num>
-  <w:num w:numId="8">
-    <w:abstractNumId w:val="8"/>
     <w:lvlOverride w:ilvl="0">
       <w:startOverride w:val="1"/>
     </w:lvlOverride>

</xml_diff>